<commit_message>
Update DevPod NodePort addendum with full files and the image mistake record
</commit_message>
<xml_diff>
--- a/docs/Homelab_DevPod_NodePort_Addendum.docx
+++ b/docs/Homelab_DevPod_NodePort_Addendum.docx
@@ -47,7 +47,7 @@
           <w:sz w:val="22"/>
           <w:szCs w:val="22"/>
         </w:rPr>
-        <w:t xml:space="preserve">Supplements the 1 October 2026 DevPod workspace build record and the SSH login addendum. This one is the LAN door. It does not replace Cloudflare for travel.</w:t>
+        <w:t xml:space="preserve">Supplements the 1 October 2026 DevPod workspace build record. Full files are included so this can be rebuilt if Git is lost.</w:t>
       </w:r>
     </w:p>
     <w:tbl>
@@ -178,7 +178,7 @@
                 <w:sz w:val="18"/>
                 <w:szCs w:val="18"/>
               </w:rPr>
-              <w:t xml:space="preserve">Parent document</w:t>
+              <w:t xml:space="preserve">Wrong image</w:t>
             </w:r>
           </w:p>
         </w:tc>
@@ -213,7 +213,7 @@
                 <w:sz w:val="18"/>
                 <w:szCs w:val="18"/>
               </w:rPr>
-              <w:t xml:space="preserve">Homelab_DevPod_Workspace_Build.docx</w:t>
+              <w:t xml:space="preserve">rancher/kubectl:v1.32.9</w:t>
             </w:r>
           </w:p>
         </w:tc>
@@ -254,7 +254,7 @@
                 <w:sz w:val="18"/>
                 <w:szCs w:val="18"/>
               </w:rPr>
-              <w:t xml:space="preserve">Commit</w:t>
+              <w:t xml:space="preserve">Correct image</w:t>
             </w:r>
           </w:p>
         </w:tc>
@@ -289,7 +289,7 @@
                 <w:sz w:val="18"/>
                 <w:szCs w:val="18"/>
               </w:rPr>
-              <w:t xml:space="preserve">8947dcf8 on main</w:t>
+              <w:t xml:space="preserve">alpine/k8s:1.32.9</w:t>
             </w:r>
           </w:p>
         </w:tc>
@@ -330,7 +330,7 @@
                 <w:sz w:val="18"/>
                 <w:szCs w:val="18"/>
               </w:rPr>
-              <w:t xml:space="preserve">File</w:t>
+              <w:t xml:space="preserve">Fix commit</w:t>
             </w:r>
           </w:p>
         </w:tc>
@@ -365,7 +365,7 @@
                 <w:sz w:val="18"/>
                 <w:szCs w:val="18"/>
               </w:rPr>
-              <w:t xml:space="preserve">apps/base/devpod/nodeport-controller.yaml</w:t>
+              <w:t xml:space="preserve">224daff4</w:t>
             </w:r>
           </w:p>
         </w:tc>
@@ -406,7 +406,7 @@
                 <w:sz w:val="18"/>
                 <w:szCs w:val="18"/>
               </w:rPr>
-              <w:t xml:space="preserve">Also listed in</w:t>
+              <w:t xml:space="preserve">Files in Git</w:t>
             </w:r>
           </w:p>
         </w:tc>
@@ -441,7 +441,7 @@
                 <w:sz w:val="18"/>
                 <w:szCs w:val="18"/>
               </w:rPr>
-              <w:t xml:space="preserve">apps/base/devpod/kustomization.yaml</w:t>
+              <w:t xml:space="preserve">nodeport-controller.yaml and kustomization.yaml</w:t>
             </w:r>
           </w:p>
         </w:tc>
@@ -482,7 +482,7 @@
                 <w:sz w:val="18"/>
                 <w:szCs w:val="18"/>
               </w:rPr>
-              <w:t xml:space="preserve">Loop</w:t>
+              <w:t xml:space="preserve">Ordinal 0</w:t>
             </w:r>
           </w:p>
         </w:tc>
@@ -517,159 +517,7 @@
                 <w:sz w:val="18"/>
                 <w:szCs w:val="18"/>
               </w:rPr>
-              <w:t xml:space="preserve">Every 20 seconds</w:t>
-            </w:r>
-          </w:p>
-        </w:tc>
-      </w:tr>
-      <w:tr>
-        <w:trPr>
-          <w:cantSplit/>
-          <w:tblHeader w:val="off"/>
-        </w:trPr>
-        <w:tc>
-          <w:tcPr>
-            <w:tcW w:type="dxa" w:w="2800"/>
-            <w:tcBorders>
-              <w:top w:val="single" w:color="BFBFBF" w:sz="4"/>
-              <w:left w:val="single" w:color="BFBFBF" w:sz="4"/>
-              <w:bottom w:val="single" w:color="BFBFBF" w:sz="4"/>
-              <w:right w:val="single" w:color="BFBFBF" w:sz="4"/>
-            </w:tcBorders>
-            <w:shd w:fill="F2F2F2" w:val="clear"/>
-            <w:tcMar>
-              <w:top w:type="dxa" w:w="60"/>
-              <w:left w:type="dxa" w:w="80"/>
-              <w:bottom w:type="dxa" w:w="60"/>
-              <w:right w:type="dxa" w:w="80"/>
-            </w:tcMar>
-            <w:vAlign w:val="center"/>
-          </w:tcPr>
-          <w:p>
-            <w:pPr>
-              <w:spacing w:after="0"/>
-            </w:pPr>
-            <w:r>
-              <w:rPr>
-                <w:rFonts w:ascii="Arial" w:cs="Arial" w:eastAsia="Arial" w:hAnsi="Arial"/>
-                <w:b w:val="false"/>
-                <w:bCs w:val="false"/>
-                <w:color w:val="000000"/>
-                <w:sz w:val="18"/>
-                <w:szCs w:val="18"/>
-              </w:rPr>
-              <w:t xml:space="preserve">Ordinal 0</w:t>
-            </w:r>
-          </w:p>
-        </w:tc>
-        <w:tc>
-          <w:tcPr>
-            <w:tcW w:type="dxa" w:w="7280"/>
-            <w:tcBorders>
-              <w:top w:val="single" w:color="BFBFBF" w:sz="4"/>
-              <w:left w:val="single" w:color="BFBFBF" w:sz="4"/>
-              <w:bottom w:val="single" w:color="BFBFBF" w:sz="4"/>
-              <w:right w:val="single" w:color="BFBFBF" w:sz="4"/>
-            </w:tcBorders>
-            <w:shd w:fill="F2F2F2" w:val="clear"/>
-            <w:tcMar>
-              <w:top w:type="dxa" w:w="60"/>
-              <w:left w:type="dxa" w:w="80"/>
-              <w:bottom w:type="dxa" w:w="60"/>
-              <w:right w:type="dxa" w:w="80"/>
-            </w:tcMar>
-            <w:vAlign w:val="center"/>
-          </w:tcPr>
-          <w:p>
-            <w:pPr>
-              <w:spacing w:after="0"/>
-            </w:pPr>
-            <w:r>
-              <w:rPr>
-                <w:rFonts w:ascii="Arial" w:cs="Arial" w:eastAsia="Arial" w:hAnsi="Arial"/>
-                <w:b w:val="false"/>
-                <w:bCs w:val="false"/>
-                <w:color w:val="000000"/>
-                <w:sz w:val="18"/>
-                <w:szCs w:val="18"/>
-              </w:rPr>
               <w:t xml:space="preserve">Service devpod-0-ssh, NodePort 32222</w:t>
-            </w:r>
-          </w:p>
-        </w:tc>
-      </w:tr>
-      <w:tr>
-        <w:trPr>
-          <w:cantSplit/>
-          <w:tblHeader w:val="off"/>
-        </w:trPr>
-        <w:tc>
-          <w:tcPr>
-            <w:tcW w:type="dxa" w:w="2800"/>
-            <w:tcBorders>
-              <w:top w:val="single" w:color="BFBFBF" w:sz="4"/>
-              <w:left w:val="single" w:color="BFBFBF" w:sz="4"/>
-              <w:bottom w:val="single" w:color="BFBFBF" w:sz="4"/>
-              <w:right w:val="single" w:color="BFBFBF" w:sz="4"/>
-            </w:tcBorders>
-            <w:shd w:fill="FFFFFF" w:val="clear"/>
-            <w:tcMar>
-              <w:top w:type="dxa" w:w="60"/>
-              <w:left w:type="dxa" w:w="80"/>
-              <w:bottom w:type="dxa" w:w="60"/>
-              <w:right w:type="dxa" w:w="80"/>
-            </w:tcMar>
-            <w:vAlign w:val="center"/>
-          </w:tcPr>
-          <w:p>
-            <w:pPr>
-              <w:spacing w:after="0"/>
-            </w:pPr>
-            <w:r>
-              <w:rPr>
-                <w:rFonts w:ascii="Arial" w:cs="Arial" w:eastAsia="Arial" w:hAnsi="Arial"/>
-                <w:b w:val="false"/>
-                <w:bCs w:val="false"/>
-                <w:color w:val="000000"/>
-                <w:sz w:val="18"/>
-                <w:szCs w:val="18"/>
-              </w:rPr>
-              <w:t xml:space="preserve">Ordinal 1</w:t>
-            </w:r>
-          </w:p>
-        </w:tc>
-        <w:tc>
-          <w:tcPr>
-            <w:tcW w:type="dxa" w:w="7280"/>
-            <w:tcBorders>
-              <w:top w:val="single" w:color="BFBFBF" w:sz="4"/>
-              <w:left w:val="single" w:color="BFBFBF" w:sz="4"/>
-              <w:bottom w:val="single" w:color="BFBFBF" w:sz="4"/>
-              <w:right w:val="single" w:color="BFBFBF" w:sz="4"/>
-            </w:tcBorders>
-            <w:shd w:fill="FFFFFF" w:val="clear"/>
-            <w:tcMar>
-              <w:top w:type="dxa" w:w="60"/>
-              <w:left w:type="dxa" w:w="80"/>
-              <w:bottom w:type="dxa" w:w="60"/>
-              <w:right w:type="dxa" w:w="80"/>
-            </w:tcMar>
-            <w:vAlign w:val="center"/>
-          </w:tcPr>
-          <w:p>
-            <w:pPr>
-              <w:spacing w:after="0"/>
-            </w:pPr>
-            <w:r>
-              <w:rPr>
-                <w:rFonts w:ascii="Arial" w:cs="Arial" w:eastAsia="Arial" w:hAnsi="Arial"/>
-                <w:b w:val="false"/>
-                <w:bCs w:val="false"/>
-                <w:color w:val="000000"/>
-                <w:sz w:val="18"/>
-                <w:szCs w:val="18"/>
-              </w:rPr>
-              <w:t xml:space="preserve">Service devpod-1-ssh, NodePort 32223</w:t>
             </w:r>
           </w:p>
         </w:tc>
@@ -692,7 +540,141 @@
           <w:sz w:val="28"/>
           <w:szCs w:val="28"/>
         </w:rPr>
-        <w:t xml:space="preserve">1. What it does</w:t>
+        <w:t xml:space="preserve">1. Mistake</w:t>
+      </w:r>
+    </w:p>
+    <w:tbl>
+      <w:tblPr>
+        <w:tblW w:type="dxa" w:w="10080"/>
+        <w:tblBorders>
+          <w:top w:val="single" w:color="auto" w:sz="4"/>
+          <w:left w:val="single" w:color="auto" w:sz="4"/>
+          <w:bottom w:val="single" w:color="auto" w:sz="4"/>
+          <w:right w:val="single" w:color="auto" w:sz="4"/>
+          <w:insideH w:val="single" w:color="auto" w:sz="4"/>
+          <w:insideV w:val="single" w:color="auto" w:sz="4"/>
+        </w:tblBorders>
+      </w:tblPr>
+      <w:tblGrid>
+        <w:gridCol w:w="10080"/>
+      </w:tblGrid>
+      <w:tr>
+        <w:trPr>
+          <w:cantSplit/>
+        </w:trPr>
+        <w:tc>
+          <w:tcPr>
+            <w:tcW w:type="dxa" w:w="10080"/>
+            <w:tcBorders>
+              <w:top w:val="single" w:color="C00000" w:sz="8"/>
+              <w:left w:val="single" w:color="C00000" w:sz="8"/>
+              <w:bottom w:val="single" w:color="C00000" w:sz="8"/>
+              <w:right w:val="single" w:color="C00000" w:sz="8"/>
+            </w:tcBorders>
+            <w:shd w:fill="FDECEC" w:val="clear"/>
+            <w:tcMar>
+              <w:top w:type="dxa" w:w="80"/>
+              <w:left w:type="dxa" w:w="120"/>
+              <w:bottom w:type="dxa" w:w="80"/>
+              <w:right w:type="dxa" w:w="120"/>
+            </w:tcMar>
+          </w:tcPr>
+          <w:p>
+            <w:pPr>
+              <w:spacing w:after="40" w:before="0"/>
+            </w:pPr>
+            <w:r>
+              <w:rPr>
+                <w:rFonts w:ascii="Arial" w:cs="Arial" w:eastAsia="Arial" w:hAnsi="Arial"/>
+                <w:b/>
+                <w:bCs/>
+                <w:color w:val="C00000"/>
+                <w:sz w:val="22"/>
+                <w:szCs w:val="22"/>
+              </w:rPr>
+              <w:t xml:space="preserve">MISTAKE: the first controller used image rancher/kubectl:v1.32.9 and command /bin/sh.</w:t>
+            </w:r>
+          </w:p>
+          <w:p>
+            <w:pPr>
+              <w:spacing w:after="40" w:before="0"/>
+            </w:pPr>
+            <w:r>
+              <w:rPr>
+                <w:rFonts w:ascii="Arial" w:cs="Arial" w:eastAsia="Arial" w:hAnsi="Arial"/>
+                <w:b/>
+                <w:bCs/>
+                <w:color w:val="C00000"/>
+                <w:sz w:val="22"/>
+                <w:szCs w:val="22"/>
+              </w:rPr>
+              <w:t xml:space="preserve">That image has no shell. Kubernetes could not start the container.</w:t>
+            </w:r>
+          </w:p>
+          <w:p>
+            <w:pPr>
+              <w:spacing w:after="40" w:before="0"/>
+            </w:pPr>
+            <w:r>
+              <w:rPr>
+                <w:rFonts w:ascii="Arial" w:cs="Arial" w:eastAsia="Arial" w:hAnsi="Arial"/>
+                <w:b/>
+                <w:bCs/>
+                <w:color w:val="C00000"/>
+                <w:sz w:val="22"/>
+                <w:szCs w:val="22"/>
+              </w:rPr>
+              <w:t xml:space="preserve">Both ReplicaSets stayed RunContainerError. devpod-0 was unaffected.</w:t>
+            </w:r>
+          </w:p>
+          <w:p>
+            <w:pPr>
+              <w:spacing w:after="40" w:before="0"/>
+            </w:pPr>
+            <w:r>
+              <w:rPr>
+                <w:rFonts w:ascii="Arial" w:cs="Arial" w:eastAsia="Arial" w:hAnsi="Arial"/>
+                <w:b/>
+                <w:bCs/>
+                <w:color w:val="C00000"/>
+                <w:sz w:val="22"/>
+                <w:szCs w:val="22"/>
+              </w:rPr>
+              <w:t xml:space="preserve">Do not put rancher/kubectl back. The correct image is alpine/k8s:1.32.9.</w:t>
+            </w:r>
+          </w:p>
+        </w:tc>
+      </w:tr>
+    </w:tbl>
+    <w:p>
+      <w:pPr>
+        <w:spacing w:after="120" w:before="140" w:line="276"/>
+      </w:pPr>
+      <w:r>
+        <w:rPr>
+          <w:rFonts w:ascii="Arial" w:cs="Arial" w:eastAsia="Arial" w:hAnsi="Arial"/>
+          <w:b/>
+          <w:bCs/>
+          <w:sz w:val="22"/>
+          <w:szCs w:val="22"/>
+        </w:rPr>
+        <w:t xml:space="preserve">Observed:</w:t>
+      </w:r>
+    </w:p>
+    <w:p>
+      <w:pPr>
+        <w:spacing w:after="40" w:before="0" w:line="276"/>
+      </w:pPr>
+      <w:r>
+        <w:rPr>
+          <w:rFonts w:ascii="Arial" w:cs="Arial" w:eastAsia="Arial" w:hAnsi="Arial"/>
+          <w:b/>
+          <w:bCs/>
+          <w:color w:val="C00000"/>
+          <w:sz w:val="22"/>
+          <w:szCs w:val="22"/>
+        </w:rPr>
+        <w:t xml:space="preserve">devpod-nodeport-59fd66469-w62sz    0/1    RunContainerError    skynet-wrk-02</w:t>
       </w:r>
     </w:p>
     <w:p>
@@ -702,10 +684,13 @@
       <w:r>
         <w:rPr>
           <w:rFonts w:ascii="Arial" w:cs="Arial" w:eastAsia="Arial" w:hAnsi="Arial"/>
+          <w:b/>
+          <w:bCs/>
+          <w:color w:val="C00000"/>
           <w:sz w:val="22"/>
           <w:szCs w:val="22"/>
         </w:rPr>
-        <w:t xml:space="preserve">The StatefulSet does not create a NodePort. A Deployment named devpod-nodeport reads spec.replicas and ensures one Service per ordinal. The Service selects only that pod, via statefulset.kubernetes.io/pod-name. Scaling down deletes the Services whose ordinal is no longer in the count. The headless Service devpod is not touched.</w:t>
+        <w:t xml:space="preserve">devpod-nodeport-6c59bf9778-rbbx9   0/1    RunContainerError    skynet-wrk-02</w:t>
       </w:r>
     </w:p>
     <w:p>
@@ -720,10 +705,13 @@
       <w:r>
         <w:rPr>
           <w:rFonts w:ascii="Arial" w:cs="Arial" w:eastAsia="Arial" w:hAnsi="Arial"/>
+          <w:b/>
+          <w:bCs/>
+          <w:color w:val="C00000"/>
           <w:sz w:val="22"/>
           <w:szCs w:val="22"/>
         </w:rPr>
-        <w:t xml:space="preserve">Port inside the pod stays 2222. The NodePort is 32222 plus the ordinal.</w:t>
+        <w:t xml:space="preserve">bitnami/kubectl:1.32.9 was also the wrong replacement. That tag is not published. It would have been ImagePullBackOff.</w:t>
       </w:r>
     </w:p>
     <w:p>
@@ -738,28 +726,13 @@
       <w:r>
         <w:rPr>
           <w:rFonts w:ascii="Arial" w:cs="Arial" w:eastAsia="Arial" w:hAnsi="Arial"/>
+          <w:b/>
+          <w:bCs/>
+          <w:color w:val="C00000"/>
           <w:sz w:val="22"/>
           <w:szCs w:val="22"/>
         </w:rPr>
-        <w:t xml:space="preserve">Any worker IP works. kube-proxy forwards the NodePort.</w:t>
-      </w:r>
-    </w:p>
-    <w:p>
-      <w:pPr>
-        <w:pStyle w:val="ListParagraph"/>
-        <w:numPr>
-          <w:ilvl w:val="0"/>
-          <w:numId w:val="2"/>
-        </w:numPr>
-        <w:spacing w:after="60" w:line="276"/>
-      </w:pPr>
-      <w:r>
-        <w:rPr>
-          <w:rFonts w:ascii="Arial" w:cs="Arial" w:eastAsia="Arial" w:hAnsi="Arial"/>
-          <w:sz w:val="22"/>
-          <w:szCs w:val="22"/>
-        </w:rPr>
-        <w:t xml:space="preserve">A kubectl scale is not how you add a replica. See section 2.</w:t>
+        <w:t xml:space="preserve">Commit 224daff4 sets image alpine/k8s:1.32.9 and keeps command /bin/sh -c.</w:t>
       </w:r>
     </w:p>
     <w:p>
@@ -779,7 +752,7 @@
           <w:sz w:val="28"/>
           <w:szCs w:val="28"/>
         </w:rPr>
-        <w:t xml:space="preserve">2. Flux resets a manual scale</w:t>
+        <w:t xml:space="preserve">2. File: apps/base/devpod/kustomization.yaml</w:t>
       </w:r>
     </w:p>
     <w:p>
@@ -792,101 +765,7 @@
           <w:sz w:val="22"/>
           <w:szCs w:val="22"/>
         </w:rPr>
-        <w:t xml:space="preserve">Yes. spec.replicas is in Git and is currently 1. The apps Kustomization reconciles about every minute and writes that value back. kubectl scale or kubectl edit does not stick unless the Git file changes, or the apps Kustomization is suspended. Suspend stops the rest of this app reconciling too. Change apps/base/devpod/devpod-statefulset.yaml and merge to keep a second pod.</w:t>
-      </w:r>
-    </w:p>
-    <w:p>
-      <w:pPr>
-        <w:pStyle w:val="Heading1"/>
-        <w:pBdr>
-          <w:bottom w:val="single" w:color="1F4E79" w:sz="8" w:space="1"/>
-        </w:pBdr>
-        <w:spacing w:after="160" w:before="360"/>
-      </w:pPr>
-      <w:r>
-        <w:rPr>
-          <w:rFonts w:ascii="Arial" w:cs="Arial" w:eastAsia="Arial" w:hAnsi="Arial"/>
-          <w:b/>
-          <w:bCs/>
-          <w:color w:val="1F4E79"/>
-          <w:sz w:val="28"/>
-          <w:szCs w:val="28"/>
-        </w:rPr>
-        <w:t xml:space="preserve">3. What this is not</w:t>
-      </w:r>
-    </w:p>
-    <w:p>
-      <w:pPr>
-        <w:pStyle w:val="ListParagraph"/>
-        <w:numPr>
-          <w:ilvl w:val="0"/>
-          <w:numId w:val="2"/>
-        </w:numPr>
-        <w:spacing w:after="60" w:line="276"/>
-      </w:pPr>
-      <w:r>
-        <w:rPr>
-          <w:rFonts w:ascii="Arial" w:cs="Arial" w:eastAsia="Arial" w:hAnsi="Arial"/>
-          <w:sz w:val="22"/>
-          <w:szCs w:val="22"/>
-        </w:rPr>
-        <w:t xml:space="preserve">Not the Cloudflare path. Away access is still a tunnel published application, not this NodePort.</w:t>
-      </w:r>
-    </w:p>
-    <w:p>
-      <w:pPr>
-        <w:pStyle w:val="ListParagraph"/>
-        <w:numPr>
-          <w:ilvl w:val="0"/>
-          <w:numId w:val="2"/>
-        </w:numPr>
-        <w:spacing w:after="60" w:line="276"/>
-      </w:pPr>
-      <w:r>
-        <w:rPr>
-          <w:rFonts w:ascii="Arial" w:cs="Arial" w:eastAsia="Arial" w:hAnsi="Arial"/>
-          <w:sz w:val="22"/>
-          <w:szCs w:val="22"/>
-        </w:rPr>
-        <w:t xml:space="preserve">Not an HTTP Ingress. SSH is TCP.</w:t>
-      </w:r>
-    </w:p>
-    <w:p>
-      <w:pPr>
-        <w:pStyle w:val="ListParagraph"/>
-        <w:numPr>
-          <w:ilvl w:val="0"/>
-          <w:numId w:val="2"/>
-        </w:numPr>
-        <w:spacing w:after="60" w:line="276"/>
-      </w:pPr>
-      <w:r>
-        <w:rPr>
-          <w:rFonts w:ascii="Arial" w:cs="Arial" w:eastAsia="Arial" w:hAnsi="Arial"/>
-          <w:sz w:val="22"/>
-          <w:szCs w:val="22"/>
-        </w:rPr>
-        <w:t xml:space="preserve">Not devpod ssh. The CLI still only lists workspaces it created.</w:t>
-      </w:r>
-    </w:p>
-    <w:p>
-      <w:pPr>
-        <w:pStyle w:val="Heading1"/>
-        <w:pBdr>
-          <w:bottom w:val="single" w:color="1F4E79" w:sz="8" w:space="1"/>
-        </w:pBdr>
-        <w:spacing w:after="160" w:before="360"/>
-      </w:pPr>
-      <w:r>
-        <w:rPr>
-          <w:rFonts w:ascii="Arial" w:cs="Arial" w:eastAsia="Arial" w:hAnsi="Arial"/>
-          <w:b/>
-          <w:bCs/>
-          <w:color w:val="1F4E79"/>
-          <w:sz w:val="28"/>
-          <w:szCs w:val="28"/>
-        </w:rPr>
-        <w:t xml:space="preserve">Appendix A. Manifests</w:t>
+        <w:t xml:space="preserve">Flux only applies files listed here. nodeport-controller.yaml is the line this change adds.</w:t>
       </w:r>
     </w:p>
     <w:p>
@@ -902,7 +781,7 @@
           <w:sz w:val="20"/>
           <w:szCs w:val="20"/>
         </w:rPr>
-        <w:t xml:space="preserve">apps/base/devpod/kustomization.yaml (resources list)</w:t>
+        <w:t xml:space="preserve">Full file</w:t>
       </w:r>
     </w:p>
     <w:tbl>
@@ -948,8 +827,34 @@
             <w:r>
               <w:rPr>
                 <w:rFonts w:ascii="Consolas" w:cs="Consolas" w:eastAsia="Consolas" w:hAnsi="Consolas"/>
-                <w:sz w:val="15"/>
-                <w:szCs w:val="15"/>
+                <w:sz w:val="14"/>
+                <w:szCs w:val="14"/>
+              </w:rPr>
+              <w:t xml:space="preserve">apiVersion: kustomize.config.k8s.io/v1beta1</w:t>
+            </w:r>
+          </w:p>
+          <w:p>
+            <w:pPr>
+              <w:spacing w:after="0" w:before="0" w:line="240"/>
+            </w:pPr>
+            <w:r>
+              <w:rPr>
+                <w:rFonts w:ascii="Consolas" w:cs="Consolas" w:eastAsia="Consolas" w:hAnsi="Consolas"/>
+                <w:sz w:val="14"/>
+                <w:szCs w:val="14"/>
+              </w:rPr>
+              <w:t xml:space="preserve">kind: Kustomization</w:t>
+            </w:r>
+          </w:p>
+          <w:p>
+            <w:pPr>
+              <w:spacing w:after="0" w:before="0" w:line="240"/>
+            </w:pPr>
+            <w:r>
+              <w:rPr>
+                <w:rFonts w:ascii="Consolas" w:cs="Consolas" w:eastAsia="Consolas" w:hAnsi="Consolas"/>
+                <w:sz w:val="14"/>
+                <w:szCs w:val="14"/>
               </w:rPr>
               <w:t xml:space="preserve">resources:</w:t>
             </w:r>
@@ -961,8 +866,8 @@
             <w:r>
               <w:rPr>
                 <w:rFonts w:ascii="Consolas" w:cs="Consolas" w:eastAsia="Consolas" w:hAnsi="Consolas"/>
-                <w:sz w:val="15"/>
-                <w:szCs w:val="15"/>
+                <w:sz w:val="14"/>
+                <w:szCs w:val="14"/>
               </w:rPr>
               <w:t xml:space="preserve">  - namespace.yaml</w:t>
             </w:r>
@@ -974,8 +879,8 @@
             <w:r>
               <w:rPr>
                 <w:rFonts w:ascii="Consolas" w:cs="Consolas" w:eastAsia="Consolas" w:hAnsi="Consolas"/>
-                <w:sz w:val="15"/>
-                <w:szCs w:val="15"/>
+                <w:sz w:val="14"/>
+                <w:szCs w:val="14"/>
               </w:rPr>
               <w:t xml:space="preserve">  - resourcequota.yaml</w:t>
             </w:r>
@@ -987,8 +892,8 @@
             <w:r>
               <w:rPr>
                 <w:rFonts w:ascii="Consolas" w:cs="Consolas" w:eastAsia="Consolas" w:hAnsi="Consolas"/>
-                <w:sz w:val="15"/>
-                <w:szCs w:val="15"/>
+                <w:sz w:val="14"/>
+                <w:szCs w:val="14"/>
               </w:rPr>
               <w:t xml:space="preserve">  - limitrange.yaml</w:t>
             </w:r>
@@ -1000,8 +905,8 @@
             <w:r>
               <w:rPr>
                 <w:rFonts w:ascii="Consolas" w:cs="Consolas" w:eastAsia="Consolas" w:hAnsi="Consolas"/>
-                <w:sz w:val="15"/>
-                <w:szCs w:val="15"/>
+                <w:sz w:val="14"/>
+                <w:szCs w:val="14"/>
               </w:rPr>
               <w:t xml:space="preserve">  - devpod-scratch-pvc.yaml</w:t>
             </w:r>
@@ -1013,8 +918,8 @@
             <w:r>
               <w:rPr>
                 <w:rFonts w:ascii="Consolas" w:cs="Consolas" w:eastAsia="Consolas" w:hAnsi="Consolas"/>
-                <w:sz w:val="15"/>
-                <w:szCs w:val="15"/>
+                <w:sz w:val="14"/>
+                <w:szCs w:val="14"/>
               </w:rPr>
               <w:t xml:space="preserve">  - service.yaml</w:t>
             </w:r>
@@ -1026,8 +931,8 @@
             <w:r>
               <w:rPr>
                 <w:rFonts w:ascii="Consolas" w:cs="Consolas" w:eastAsia="Consolas" w:hAnsi="Consolas"/>
-                <w:sz w:val="15"/>
-                <w:szCs w:val="15"/>
+                <w:sz w:val="14"/>
+                <w:szCs w:val="14"/>
               </w:rPr>
               <w:t xml:space="preserve">  - devpod-statefulset.yaml</w:t>
             </w:r>
@@ -1039,8 +944,8 @@
             <w:r>
               <w:rPr>
                 <w:rFonts w:ascii="Consolas" w:cs="Consolas" w:eastAsia="Consolas" w:hAnsi="Consolas"/>
-                <w:sz w:val="15"/>
-                <w:szCs w:val="15"/>
+                <w:sz w:val="14"/>
+                <w:szCs w:val="14"/>
               </w:rPr>
               <w:t xml:space="preserve">  - nodeport-controller.yaml</w:t>
             </w:r>
@@ -1048,6 +953,39 @@
         </w:tc>
       </w:tr>
     </w:tbl>
+    <w:p>
+      <w:pPr>
+        <w:pStyle w:val="Heading1"/>
+        <w:pBdr>
+          <w:bottom w:val="single" w:color="1F4E79" w:sz="8" w:space="1"/>
+        </w:pBdr>
+        <w:spacing w:after="160" w:before="360"/>
+      </w:pPr>
+      <w:r>
+        <w:rPr>
+          <w:rFonts w:ascii="Arial" w:cs="Arial" w:eastAsia="Arial" w:hAnsi="Arial"/>
+          <w:b/>
+          <w:bCs/>
+          <w:color w:val="1F4E79"/>
+          <w:sz w:val="28"/>
+          <w:szCs w:val="28"/>
+        </w:rPr>
+        <w:t xml:space="preserve">3. File: apps/base/devpod/nodeport-controller.yaml</w:t>
+      </w:r>
+    </w:p>
+    <w:p>
+      <w:pPr>
+        <w:spacing w:after="120" w:before="0" w:line="276"/>
+      </w:pPr>
+      <w:r>
+        <w:rPr>
+          <w:rFonts w:ascii="Arial" w:cs="Arial" w:eastAsia="Arial" w:hAnsi="Arial"/>
+          <w:sz w:val="22"/>
+          <w:szCs w:val="22"/>
+        </w:rPr>
+        <w:t xml:space="preserve">Correct file. Image line is alpine/k8s:1.32.9. Four objects in one file, split by ---.</w:t>
+      </w:r>
+    </w:p>
     <w:p>
       <w:pPr>
         <w:spacing w:after="60" w:before="200"/>
@@ -1061,7 +999,7 @@
           <w:sz w:val="20"/>
           <w:szCs w:val="20"/>
         </w:rPr>
-        <w:t xml:space="preserve">Service the controller applies for ordinal 0</w:t>
+        <w:t xml:space="preserve">Full file, correct image</w:t>
       </w:r>
     </w:p>
     <w:tbl>
@@ -1107,8 +1045,8 @@
             <w:r>
               <w:rPr>
                 <w:rFonts w:ascii="Consolas" w:cs="Consolas" w:eastAsia="Consolas" w:hAnsi="Consolas"/>
-                <w:sz w:val="15"/>
-                <w:szCs w:val="15"/>
+                <w:sz w:val="14"/>
+                <w:szCs w:val="14"/>
               </w:rPr>
               <w:t xml:space="preserve">apiVersion: v1</w:t>
             </w:r>
@@ -1120,21 +1058,21 @@
             <w:r>
               <w:rPr>
                 <w:rFonts w:ascii="Consolas" w:cs="Consolas" w:eastAsia="Consolas" w:hAnsi="Consolas"/>
-                <w:sz w:val="15"/>
-                <w:szCs w:val="15"/>
-              </w:rPr>
-              <w:t xml:space="preserve">kind: Service</w:t>
-            </w:r>
-          </w:p>
-          <w:p>
-            <w:pPr>
-              <w:spacing w:after="0" w:before="0" w:line="240"/>
-            </w:pPr>
-            <w:r>
-              <w:rPr>
-                <w:rFonts w:ascii="Consolas" w:cs="Consolas" w:eastAsia="Consolas" w:hAnsi="Consolas"/>
-                <w:sz w:val="15"/>
-                <w:szCs w:val="15"/>
+                <w:sz w:val="14"/>
+                <w:szCs w:val="14"/>
+              </w:rPr>
+              <w:t xml:space="preserve">kind: ServiceAccount</w:t>
+            </w:r>
+          </w:p>
+          <w:p>
+            <w:pPr>
+              <w:spacing w:after="0" w:before="0" w:line="240"/>
+            </w:pPr>
+            <w:r>
+              <w:rPr>
+                <w:rFonts w:ascii="Consolas" w:cs="Consolas" w:eastAsia="Consolas" w:hAnsi="Consolas"/>
+                <w:sz w:val="14"/>
+                <w:szCs w:val="14"/>
               </w:rPr>
               <w:t xml:space="preserve">metadata:</w:t>
             </w:r>
@@ -1146,21 +1084,21 @@
             <w:r>
               <w:rPr>
                 <w:rFonts w:ascii="Consolas" w:cs="Consolas" w:eastAsia="Consolas" w:hAnsi="Consolas"/>
-                <w:sz w:val="15"/>
-                <w:szCs w:val="15"/>
-              </w:rPr>
-              <w:t xml:space="preserve">  name: devpod-0-ssh</w:t>
-            </w:r>
-          </w:p>
-          <w:p>
-            <w:pPr>
-              <w:spacing w:after="0" w:before="0" w:line="240"/>
-            </w:pPr>
-            <w:r>
-              <w:rPr>
-                <w:rFonts w:ascii="Consolas" w:cs="Consolas" w:eastAsia="Consolas" w:hAnsi="Consolas"/>
-                <w:sz w:val="15"/>
-                <w:szCs w:val="15"/>
+                <w:sz w:val="14"/>
+                <w:szCs w:val="14"/>
+              </w:rPr>
+              <w:t xml:space="preserve">  name: devpod-nodeport</w:t>
+            </w:r>
+          </w:p>
+          <w:p>
+            <w:pPr>
+              <w:spacing w:after="0" w:before="0" w:line="240"/>
+            </w:pPr>
+            <w:r>
+              <w:rPr>
+                <w:rFonts w:ascii="Consolas" w:cs="Consolas" w:eastAsia="Consolas" w:hAnsi="Consolas"/>
+                <w:sz w:val="14"/>
+                <w:szCs w:val="14"/>
               </w:rPr>
               <w:t xml:space="preserve">  namespace: devpod</w:t>
             </w:r>
@@ -1172,8 +1110,8 @@
             <w:r>
               <w:rPr>
                 <w:rFonts w:ascii="Consolas" w:cs="Consolas" w:eastAsia="Consolas" w:hAnsi="Consolas"/>
-                <w:sz w:val="15"/>
-                <w:szCs w:val="15"/>
+                <w:sz w:val="14"/>
+                <w:szCs w:val="14"/>
               </w:rPr>
               <w:t xml:space="preserve">  labels:</w:t>
             </w:r>
@@ -1185,21 +1123,21 @@
             <w:r>
               <w:rPr>
                 <w:rFonts w:ascii="Consolas" w:cs="Consolas" w:eastAsia="Consolas" w:hAnsi="Consolas"/>
-                <w:sz w:val="15"/>
-                <w:szCs w:val="15"/>
-              </w:rPr>
-              <w:t xml:space="preserve">    app.kubernetes.io/name: devpod</w:t>
-            </w:r>
-          </w:p>
-          <w:p>
-            <w:pPr>
-              <w:spacing w:after="0" w:before="0" w:line="240"/>
-            </w:pPr>
-            <w:r>
-              <w:rPr>
-                <w:rFonts w:ascii="Consolas" w:cs="Consolas" w:eastAsia="Consolas" w:hAnsi="Consolas"/>
-                <w:sz w:val="15"/>
-                <w:szCs w:val="15"/>
+                <w:sz w:val="14"/>
+                <w:szCs w:val="14"/>
+              </w:rPr>
+              <w:t xml:space="preserve">    app.kubernetes.io/name: devpod-nodeport</w:t>
+            </w:r>
+          </w:p>
+          <w:p>
+            <w:pPr>
+              <w:spacing w:after="0" w:before="0" w:line="240"/>
+            </w:pPr>
+            <w:r>
+              <w:rPr>
+                <w:rFonts w:ascii="Consolas" w:cs="Consolas" w:eastAsia="Consolas" w:hAnsi="Consolas"/>
+                <w:sz w:val="14"/>
+                <w:szCs w:val="14"/>
               </w:rPr>
               <w:t xml:space="preserve">    app.kubernetes.io/part-of: homelab-dev</w:t>
             </w:r>
@@ -1211,21 +1149,567 @@
             <w:r>
               <w:rPr>
                 <w:rFonts w:ascii="Consolas" w:cs="Consolas" w:eastAsia="Consolas" w:hAnsi="Consolas"/>
-                <w:sz w:val="15"/>
-                <w:szCs w:val="15"/>
-              </w:rPr>
-              <w:t xml:space="preserve">    app.kubernetes.io/managed-by: devpod-nodeport</w:t>
-            </w:r>
-          </w:p>
-          <w:p>
-            <w:pPr>
-              <w:spacing w:after="0" w:before="0" w:line="240"/>
-            </w:pPr>
-            <w:r>
-              <w:rPr>
-                <w:rFonts w:ascii="Consolas" w:cs="Consolas" w:eastAsia="Consolas" w:hAnsi="Consolas"/>
-                <w:sz w:val="15"/>
-                <w:szCs w:val="15"/>
+                <w:sz w:val="14"/>
+                <w:szCs w:val="14"/>
+              </w:rPr>
+              <w:t xml:space="preserve">---</w:t>
+            </w:r>
+          </w:p>
+          <w:p>
+            <w:pPr>
+              <w:spacing w:after="0" w:before="0" w:line="240"/>
+            </w:pPr>
+            <w:r>
+              <w:rPr>
+                <w:rFonts w:ascii="Consolas" w:cs="Consolas" w:eastAsia="Consolas" w:hAnsi="Consolas"/>
+                <w:sz w:val="14"/>
+                <w:szCs w:val="14"/>
+              </w:rPr>
+              <w:t xml:space="preserve">apiVersion: rbac.authorization.k8s.io/v1</w:t>
+            </w:r>
+          </w:p>
+          <w:p>
+            <w:pPr>
+              <w:spacing w:after="0" w:before="0" w:line="240"/>
+            </w:pPr>
+            <w:r>
+              <w:rPr>
+                <w:rFonts w:ascii="Consolas" w:cs="Consolas" w:eastAsia="Consolas" w:hAnsi="Consolas"/>
+                <w:sz w:val="14"/>
+                <w:szCs w:val="14"/>
+              </w:rPr>
+              <w:t xml:space="preserve">kind: Role</w:t>
+            </w:r>
+          </w:p>
+          <w:p>
+            <w:pPr>
+              <w:spacing w:after="0" w:before="0" w:line="240"/>
+            </w:pPr>
+            <w:r>
+              <w:rPr>
+                <w:rFonts w:ascii="Consolas" w:cs="Consolas" w:eastAsia="Consolas" w:hAnsi="Consolas"/>
+                <w:sz w:val="14"/>
+                <w:szCs w:val="14"/>
+              </w:rPr>
+              <w:t xml:space="preserve">metadata:</w:t>
+            </w:r>
+          </w:p>
+          <w:p>
+            <w:pPr>
+              <w:spacing w:after="0" w:before="0" w:line="240"/>
+            </w:pPr>
+            <w:r>
+              <w:rPr>
+                <w:rFonts w:ascii="Consolas" w:cs="Consolas" w:eastAsia="Consolas" w:hAnsi="Consolas"/>
+                <w:sz w:val="14"/>
+                <w:szCs w:val="14"/>
+              </w:rPr>
+              <w:t xml:space="preserve">  name: devpod-nodeport</w:t>
+            </w:r>
+          </w:p>
+          <w:p>
+            <w:pPr>
+              <w:spacing w:after="0" w:before="0" w:line="240"/>
+            </w:pPr>
+            <w:r>
+              <w:rPr>
+                <w:rFonts w:ascii="Consolas" w:cs="Consolas" w:eastAsia="Consolas" w:hAnsi="Consolas"/>
+                <w:sz w:val="14"/>
+                <w:szCs w:val="14"/>
+              </w:rPr>
+              <w:t xml:space="preserve">  namespace: devpod</w:t>
+            </w:r>
+          </w:p>
+          <w:p>
+            <w:pPr>
+              <w:spacing w:after="0" w:before="0" w:line="240"/>
+            </w:pPr>
+            <w:r>
+              <w:rPr>
+                <w:rFonts w:ascii="Consolas" w:cs="Consolas" w:eastAsia="Consolas" w:hAnsi="Consolas"/>
+                <w:sz w:val="14"/>
+                <w:szCs w:val="14"/>
+              </w:rPr>
+              <w:t xml:space="preserve">  labels:</w:t>
+            </w:r>
+          </w:p>
+          <w:p>
+            <w:pPr>
+              <w:spacing w:after="0" w:before="0" w:line="240"/>
+            </w:pPr>
+            <w:r>
+              <w:rPr>
+                <w:rFonts w:ascii="Consolas" w:cs="Consolas" w:eastAsia="Consolas" w:hAnsi="Consolas"/>
+                <w:sz w:val="14"/>
+                <w:szCs w:val="14"/>
+              </w:rPr>
+              <w:t xml:space="preserve">    app.kubernetes.io/name: devpod-nodeport</w:t>
+            </w:r>
+          </w:p>
+          <w:p>
+            <w:pPr>
+              <w:spacing w:after="0" w:before="0" w:line="240"/>
+            </w:pPr>
+            <w:r>
+              <w:rPr>
+                <w:rFonts w:ascii="Consolas" w:cs="Consolas" w:eastAsia="Consolas" w:hAnsi="Consolas"/>
+                <w:sz w:val="14"/>
+                <w:szCs w:val="14"/>
+              </w:rPr>
+              <w:t xml:space="preserve">    app.kubernetes.io/part-of: homelab-dev</w:t>
+            </w:r>
+          </w:p>
+          <w:p>
+            <w:pPr>
+              <w:spacing w:after="0" w:before="0" w:line="240"/>
+            </w:pPr>
+            <w:r>
+              <w:rPr>
+                <w:rFonts w:ascii="Consolas" w:cs="Consolas" w:eastAsia="Consolas" w:hAnsi="Consolas"/>
+                <w:sz w:val="14"/>
+                <w:szCs w:val="14"/>
+              </w:rPr>
+              <w:t xml:space="preserve">rules:</w:t>
+            </w:r>
+          </w:p>
+          <w:p>
+            <w:pPr>
+              <w:spacing w:after="0" w:before="0" w:line="240"/>
+            </w:pPr>
+            <w:r>
+              <w:rPr>
+                <w:rFonts w:ascii="Consolas" w:cs="Consolas" w:eastAsia="Consolas" w:hAnsi="Consolas"/>
+                <w:sz w:val="14"/>
+                <w:szCs w:val="14"/>
+              </w:rPr>
+              <w:t xml:space="preserve">  - apiGroups: ["apps"]</w:t>
+            </w:r>
+          </w:p>
+          <w:p>
+            <w:pPr>
+              <w:spacing w:after="0" w:before="0" w:line="240"/>
+            </w:pPr>
+            <w:r>
+              <w:rPr>
+                <w:rFonts w:ascii="Consolas" w:cs="Consolas" w:eastAsia="Consolas" w:hAnsi="Consolas"/>
+                <w:sz w:val="14"/>
+                <w:szCs w:val="14"/>
+              </w:rPr>
+              <w:t xml:space="preserve">    resources: ["statefulsets"]</w:t>
+            </w:r>
+          </w:p>
+          <w:p>
+            <w:pPr>
+              <w:spacing w:after="0" w:before="0" w:line="240"/>
+            </w:pPr>
+            <w:r>
+              <w:rPr>
+                <w:rFonts w:ascii="Consolas" w:cs="Consolas" w:eastAsia="Consolas" w:hAnsi="Consolas"/>
+                <w:sz w:val="14"/>
+                <w:szCs w:val="14"/>
+              </w:rPr>
+              <w:t xml:space="preserve">    resourceNames: ["devpod"]</w:t>
+            </w:r>
+          </w:p>
+          <w:p>
+            <w:pPr>
+              <w:spacing w:after="0" w:before="0" w:line="240"/>
+            </w:pPr>
+            <w:r>
+              <w:rPr>
+                <w:rFonts w:ascii="Consolas" w:cs="Consolas" w:eastAsia="Consolas" w:hAnsi="Consolas"/>
+                <w:sz w:val="14"/>
+                <w:szCs w:val="14"/>
+              </w:rPr>
+              <w:t xml:space="preserve">    verbs: ["get"]</w:t>
+            </w:r>
+          </w:p>
+          <w:p>
+            <w:pPr>
+              <w:spacing w:after="0" w:before="0" w:line="240"/>
+            </w:pPr>
+            <w:r>
+              <w:rPr>
+                <w:rFonts w:ascii="Consolas" w:cs="Consolas" w:eastAsia="Consolas" w:hAnsi="Consolas"/>
+                <w:sz w:val="14"/>
+                <w:szCs w:val="14"/>
+              </w:rPr>
+              <w:t xml:space="preserve">  - apiGroups: [""]</w:t>
+            </w:r>
+          </w:p>
+          <w:p>
+            <w:pPr>
+              <w:spacing w:after="0" w:before="0" w:line="240"/>
+            </w:pPr>
+            <w:r>
+              <w:rPr>
+                <w:rFonts w:ascii="Consolas" w:cs="Consolas" w:eastAsia="Consolas" w:hAnsi="Consolas"/>
+                <w:sz w:val="14"/>
+                <w:szCs w:val="14"/>
+              </w:rPr>
+              <w:t xml:space="preserve">    resources: ["services"]</w:t>
+            </w:r>
+          </w:p>
+          <w:p>
+            <w:pPr>
+              <w:spacing w:after="0" w:before="0" w:line="240"/>
+            </w:pPr>
+            <w:r>
+              <w:rPr>
+                <w:rFonts w:ascii="Consolas" w:cs="Consolas" w:eastAsia="Consolas" w:hAnsi="Consolas"/>
+                <w:sz w:val="14"/>
+                <w:szCs w:val="14"/>
+              </w:rPr>
+              <w:t xml:space="preserve">    verbs: ["get", "list", "create", "patch", "delete"]</w:t>
+            </w:r>
+          </w:p>
+          <w:p>
+            <w:pPr>
+              <w:spacing w:after="0" w:before="0" w:line="240"/>
+            </w:pPr>
+            <w:r>
+              <w:rPr>
+                <w:rFonts w:ascii="Consolas" w:cs="Consolas" w:eastAsia="Consolas" w:hAnsi="Consolas"/>
+                <w:sz w:val="14"/>
+                <w:szCs w:val="14"/>
+              </w:rPr>
+              <w:t xml:space="preserve">---</w:t>
+            </w:r>
+          </w:p>
+          <w:p>
+            <w:pPr>
+              <w:spacing w:after="0" w:before="0" w:line="240"/>
+            </w:pPr>
+            <w:r>
+              <w:rPr>
+                <w:rFonts w:ascii="Consolas" w:cs="Consolas" w:eastAsia="Consolas" w:hAnsi="Consolas"/>
+                <w:sz w:val="14"/>
+                <w:szCs w:val="14"/>
+              </w:rPr>
+              <w:t xml:space="preserve">apiVersion: rbac.authorization.k8s.io/v1</w:t>
+            </w:r>
+          </w:p>
+          <w:p>
+            <w:pPr>
+              <w:spacing w:after="0" w:before="0" w:line="240"/>
+            </w:pPr>
+            <w:r>
+              <w:rPr>
+                <w:rFonts w:ascii="Consolas" w:cs="Consolas" w:eastAsia="Consolas" w:hAnsi="Consolas"/>
+                <w:sz w:val="14"/>
+                <w:szCs w:val="14"/>
+              </w:rPr>
+              <w:t xml:space="preserve">kind: RoleBinding</w:t>
+            </w:r>
+          </w:p>
+          <w:p>
+            <w:pPr>
+              <w:spacing w:after="0" w:before="0" w:line="240"/>
+            </w:pPr>
+            <w:r>
+              <w:rPr>
+                <w:rFonts w:ascii="Consolas" w:cs="Consolas" w:eastAsia="Consolas" w:hAnsi="Consolas"/>
+                <w:sz w:val="14"/>
+                <w:szCs w:val="14"/>
+              </w:rPr>
+              <w:t xml:space="preserve">metadata:</w:t>
+            </w:r>
+          </w:p>
+          <w:p>
+            <w:pPr>
+              <w:spacing w:after="0" w:before="0" w:line="240"/>
+            </w:pPr>
+            <w:r>
+              <w:rPr>
+                <w:rFonts w:ascii="Consolas" w:cs="Consolas" w:eastAsia="Consolas" w:hAnsi="Consolas"/>
+                <w:sz w:val="14"/>
+                <w:szCs w:val="14"/>
+              </w:rPr>
+              <w:t xml:space="preserve">  name: devpod-nodeport</w:t>
+            </w:r>
+          </w:p>
+          <w:p>
+            <w:pPr>
+              <w:spacing w:after="0" w:before="0" w:line="240"/>
+            </w:pPr>
+            <w:r>
+              <w:rPr>
+                <w:rFonts w:ascii="Consolas" w:cs="Consolas" w:eastAsia="Consolas" w:hAnsi="Consolas"/>
+                <w:sz w:val="14"/>
+                <w:szCs w:val="14"/>
+              </w:rPr>
+              <w:t xml:space="preserve">  namespace: devpod</w:t>
+            </w:r>
+          </w:p>
+          <w:p>
+            <w:pPr>
+              <w:spacing w:after="0" w:before="0" w:line="240"/>
+            </w:pPr>
+            <w:r>
+              <w:rPr>
+                <w:rFonts w:ascii="Consolas" w:cs="Consolas" w:eastAsia="Consolas" w:hAnsi="Consolas"/>
+                <w:sz w:val="14"/>
+                <w:szCs w:val="14"/>
+              </w:rPr>
+              <w:t xml:space="preserve">  labels:</w:t>
+            </w:r>
+          </w:p>
+          <w:p>
+            <w:pPr>
+              <w:spacing w:after="0" w:before="0" w:line="240"/>
+            </w:pPr>
+            <w:r>
+              <w:rPr>
+                <w:rFonts w:ascii="Consolas" w:cs="Consolas" w:eastAsia="Consolas" w:hAnsi="Consolas"/>
+                <w:sz w:val="14"/>
+                <w:szCs w:val="14"/>
+              </w:rPr>
+              <w:t xml:space="preserve">    app.kubernetes.io/name: devpod-nodeport</w:t>
+            </w:r>
+          </w:p>
+          <w:p>
+            <w:pPr>
+              <w:spacing w:after="0" w:before="0" w:line="240"/>
+            </w:pPr>
+            <w:r>
+              <w:rPr>
+                <w:rFonts w:ascii="Consolas" w:cs="Consolas" w:eastAsia="Consolas" w:hAnsi="Consolas"/>
+                <w:sz w:val="14"/>
+                <w:szCs w:val="14"/>
+              </w:rPr>
+              <w:t xml:space="preserve">    app.kubernetes.io/part-of: homelab-dev</w:t>
+            </w:r>
+          </w:p>
+          <w:p>
+            <w:pPr>
+              <w:spacing w:after="0" w:before="0" w:line="240"/>
+            </w:pPr>
+            <w:r>
+              <w:rPr>
+                <w:rFonts w:ascii="Consolas" w:cs="Consolas" w:eastAsia="Consolas" w:hAnsi="Consolas"/>
+                <w:sz w:val="14"/>
+                <w:szCs w:val="14"/>
+              </w:rPr>
+              <w:t xml:space="preserve">roleRef:</w:t>
+            </w:r>
+          </w:p>
+          <w:p>
+            <w:pPr>
+              <w:spacing w:after="0" w:before="0" w:line="240"/>
+            </w:pPr>
+            <w:r>
+              <w:rPr>
+                <w:rFonts w:ascii="Consolas" w:cs="Consolas" w:eastAsia="Consolas" w:hAnsi="Consolas"/>
+                <w:sz w:val="14"/>
+                <w:szCs w:val="14"/>
+              </w:rPr>
+              <w:t xml:space="preserve">  apiGroup: rbac.authorization.k8s.io</w:t>
+            </w:r>
+          </w:p>
+          <w:p>
+            <w:pPr>
+              <w:spacing w:after="0" w:before="0" w:line="240"/>
+            </w:pPr>
+            <w:r>
+              <w:rPr>
+                <w:rFonts w:ascii="Consolas" w:cs="Consolas" w:eastAsia="Consolas" w:hAnsi="Consolas"/>
+                <w:sz w:val="14"/>
+                <w:szCs w:val="14"/>
+              </w:rPr>
+              <w:t xml:space="preserve">  kind: Role</w:t>
+            </w:r>
+          </w:p>
+          <w:p>
+            <w:pPr>
+              <w:spacing w:after="0" w:before="0" w:line="240"/>
+            </w:pPr>
+            <w:r>
+              <w:rPr>
+                <w:rFonts w:ascii="Consolas" w:cs="Consolas" w:eastAsia="Consolas" w:hAnsi="Consolas"/>
+                <w:sz w:val="14"/>
+                <w:szCs w:val="14"/>
+              </w:rPr>
+              <w:t xml:space="preserve">  name: devpod-nodeport</w:t>
+            </w:r>
+          </w:p>
+          <w:p>
+            <w:pPr>
+              <w:spacing w:after="0" w:before="0" w:line="240"/>
+            </w:pPr>
+            <w:r>
+              <w:rPr>
+                <w:rFonts w:ascii="Consolas" w:cs="Consolas" w:eastAsia="Consolas" w:hAnsi="Consolas"/>
+                <w:sz w:val="14"/>
+                <w:szCs w:val="14"/>
+              </w:rPr>
+              <w:t xml:space="preserve">subjects:</w:t>
+            </w:r>
+          </w:p>
+          <w:p>
+            <w:pPr>
+              <w:spacing w:after="0" w:before="0" w:line="240"/>
+            </w:pPr>
+            <w:r>
+              <w:rPr>
+                <w:rFonts w:ascii="Consolas" w:cs="Consolas" w:eastAsia="Consolas" w:hAnsi="Consolas"/>
+                <w:sz w:val="14"/>
+                <w:szCs w:val="14"/>
+              </w:rPr>
+              <w:t xml:space="preserve">  - kind: ServiceAccount</w:t>
+            </w:r>
+          </w:p>
+          <w:p>
+            <w:pPr>
+              <w:spacing w:after="0" w:before="0" w:line="240"/>
+            </w:pPr>
+            <w:r>
+              <w:rPr>
+                <w:rFonts w:ascii="Consolas" w:cs="Consolas" w:eastAsia="Consolas" w:hAnsi="Consolas"/>
+                <w:sz w:val="14"/>
+                <w:szCs w:val="14"/>
+              </w:rPr>
+              <w:t xml:space="preserve">    name: devpod-nodeport</w:t>
+            </w:r>
+          </w:p>
+          <w:p>
+            <w:pPr>
+              <w:spacing w:after="0" w:before="0" w:line="240"/>
+            </w:pPr>
+            <w:r>
+              <w:rPr>
+                <w:rFonts w:ascii="Consolas" w:cs="Consolas" w:eastAsia="Consolas" w:hAnsi="Consolas"/>
+                <w:sz w:val="14"/>
+                <w:szCs w:val="14"/>
+              </w:rPr>
+              <w:t xml:space="preserve">    namespace: devpod</w:t>
+            </w:r>
+          </w:p>
+          <w:p>
+            <w:pPr>
+              <w:spacing w:after="0" w:before="0" w:line="240"/>
+            </w:pPr>
+            <w:r>
+              <w:rPr>
+                <w:rFonts w:ascii="Consolas" w:cs="Consolas" w:eastAsia="Consolas" w:hAnsi="Consolas"/>
+                <w:sz w:val="14"/>
+                <w:szCs w:val="14"/>
+              </w:rPr>
+              <w:t xml:space="preserve">---</w:t>
+            </w:r>
+          </w:p>
+          <w:p>
+            <w:pPr>
+              <w:spacing w:after="0" w:before="0" w:line="240"/>
+            </w:pPr>
+            <w:r>
+              <w:rPr>
+                <w:rFonts w:ascii="Consolas" w:cs="Consolas" w:eastAsia="Consolas" w:hAnsi="Consolas"/>
+                <w:sz w:val="14"/>
+                <w:szCs w:val="14"/>
+              </w:rPr>
+              <w:t xml:space="preserve">apiVersion: apps/v1</w:t>
+            </w:r>
+          </w:p>
+          <w:p>
+            <w:pPr>
+              <w:spacing w:after="0" w:before="0" w:line="240"/>
+            </w:pPr>
+            <w:r>
+              <w:rPr>
+                <w:rFonts w:ascii="Consolas" w:cs="Consolas" w:eastAsia="Consolas" w:hAnsi="Consolas"/>
+                <w:sz w:val="14"/>
+                <w:szCs w:val="14"/>
+              </w:rPr>
+              <w:t xml:space="preserve">kind: Deployment</w:t>
+            </w:r>
+          </w:p>
+          <w:p>
+            <w:pPr>
+              <w:spacing w:after="0" w:before="0" w:line="240"/>
+            </w:pPr>
+            <w:r>
+              <w:rPr>
+                <w:rFonts w:ascii="Consolas" w:cs="Consolas" w:eastAsia="Consolas" w:hAnsi="Consolas"/>
+                <w:sz w:val="14"/>
+                <w:szCs w:val="14"/>
+              </w:rPr>
+              <w:t xml:space="preserve">metadata:</w:t>
+            </w:r>
+          </w:p>
+          <w:p>
+            <w:pPr>
+              <w:spacing w:after="0" w:before="0" w:line="240"/>
+            </w:pPr>
+            <w:r>
+              <w:rPr>
+                <w:rFonts w:ascii="Consolas" w:cs="Consolas" w:eastAsia="Consolas" w:hAnsi="Consolas"/>
+                <w:sz w:val="14"/>
+                <w:szCs w:val="14"/>
+              </w:rPr>
+              <w:t xml:space="preserve">  name: devpod-nodeport</w:t>
+            </w:r>
+          </w:p>
+          <w:p>
+            <w:pPr>
+              <w:spacing w:after="0" w:before="0" w:line="240"/>
+            </w:pPr>
+            <w:r>
+              <w:rPr>
+                <w:rFonts w:ascii="Consolas" w:cs="Consolas" w:eastAsia="Consolas" w:hAnsi="Consolas"/>
+                <w:sz w:val="14"/>
+                <w:szCs w:val="14"/>
+              </w:rPr>
+              <w:t xml:space="preserve">  namespace: devpod</w:t>
+            </w:r>
+          </w:p>
+          <w:p>
+            <w:pPr>
+              <w:spacing w:after="0" w:before="0" w:line="240"/>
+            </w:pPr>
+            <w:r>
+              <w:rPr>
+                <w:rFonts w:ascii="Consolas" w:cs="Consolas" w:eastAsia="Consolas" w:hAnsi="Consolas"/>
+                <w:sz w:val="14"/>
+                <w:szCs w:val="14"/>
+              </w:rPr>
+              <w:t xml:space="preserve">  labels:</w:t>
+            </w:r>
+          </w:p>
+          <w:p>
+            <w:pPr>
+              <w:spacing w:after="0" w:before="0" w:line="240"/>
+            </w:pPr>
+            <w:r>
+              <w:rPr>
+                <w:rFonts w:ascii="Consolas" w:cs="Consolas" w:eastAsia="Consolas" w:hAnsi="Consolas"/>
+                <w:sz w:val="14"/>
+                <w:szCs w:val="14"/>
+              </w:rPr>
+              <w:t xml:space="preserve">    app.kubernetes.io/name: devpod-nodeport</w:t>
+            </w:r>
+          </w:p>
+          <w:p>
+            <w:pPr>
+              <w:spacing w:after="0" w:before="0" w:line="240"/>
+            </w:pPr>
+            <w:r>
+              <w:rPr>
+                <w:rFonts w:ascii="Consolas" w:cs="Consolas" w:eastAsia="Consolas" w:hAnsi="Consolas"/>
+                <w:sz w:val="14"/>
+                <w:szCs w:val="14"/>
+              </w:rPr>
+              <w:t xml:space="preserve">    app.kubernetes.io/part-of: homelab-dev</w:t>
+            </w:r>
+          </w:p>
+          <w:p>
+            <w:pPr>
+              <w:spacing w:after="0" w:before="0" w:line="240"/>
+            </w:pPr>
+            <w:r>
+              <w:rPr>
+                <w:rFonts w:ascii="Consolas" w:cs="Consolas" w:eastAsia="Consolas" w:hAnsi="Consolas"/>
+                <w:sz w:val="14"/>
+                <w:szCs w:val="14"/>
               </w:rPr>
               <w:t xml:space="preserve">spec:</w:t>
             </w:r>
@@ -1237,21 +1721,21 @@
             <w:r>
               <w:rPr>
                 <w:rFonts w:ascii="Consolas" w:cs="Consolas" w:eastAsia="Consolas" w:hAnsi="Consolas"/>
-                <w:sz w:val="15"/>
-                <w:szCs w:val="15"/>
-              </w:rPr>
-              <w:t xml:space="preserve">  type: NodePort</w:t>
-            </w:r>
-          </w:p>
-          <w:p>
-            <w:pPr>
-              <w:spacing w:after="0" w:before="0" w:line="240"/>
-            </w:pPr>
-            <w:r>
-              <w:rPr>
-                <w:rFonts w:ascii="Consolas" w:cs="Consolas" w:eastAsia="Consolas" w:hAnsi="Consolas"/>
-                <w:sz w:val="15"/>
-                <w:szCs w:val="15"/>
+                <w:sz w:val="14"/>
+                <w:szCs w:val="14"/>
+              </w:rPr>
+              <w:t xml:space="preserve">  replicas: 1</w:t>
+            </w:r>
+          </w:p>
+          <w:p>
+            <w:pPr>
+              <w:spacing w:after="0" w:before="0" w:line="240"/>
+            </w:pPr>
+            <w:r>
+              <w:rPr>
+                <w:rFonts w:ascii="Consolas" w:cs="Consolas" w:eastAsia="Consolas" w:hAnsi="Consolas"/>
+                <w:sz w:val="14"/>
+                <w:szCs w:val="14"/>
               </w:rPr>
               <w:t xml:space="preserve">  selector:</w:t>
             </w:r>
@@ -1263,75 +1747,1128 @@
             <w:r>
               <w:rPr>
                 <w:rFonts w:ascii="Consolas" w:cs="Consolas" w:eastAsia="Consolas" w:hAnsi="Consolas"/>
-                <w:sz w:val="15"/>
-                <w:szCs w:val="15"/>
-              </w:rPr>
-              <w:t xml:space="preserve">    statefulset.kubernetes.io/pod-name: devpod-0</w:t>
-            </w:r>
-          </w:p>
-          <w:p>
-            <w:pPr>
-              <w:spacing w:after="0" w:before="0" w:line="240"/>
-            </w:pPr>
-            <w:r>
-              <w:rPr>
-                <w:rFonts w:ascii="Consolas" w:cs="Consolas" w:eastAsia="Consolas" w:hAnsi="Consolas"/>
-                <w:sz w:val="15"/>
-                <w:szCs w:val="15"/>
-              </w:rPr>
-              <w:t xml:space="preserve">  ports:</w:t>
-            </w:r>
-          </w:p>
-          <w:p>
-            <w:pPr>
-              <w:spacing w:after="0" w:before="0" w:line="240"/>
-            </w:pPr>
-            <w:r>
-              <w:rPr>
-                <w:rFonts w:ascii="Consolas" w:cs="Consolas" w:eastAsia="Consolas" w:hAnsi="Consolas"/>
-                <w:sz w:val="15"/>
-                <w:szCs w:val="15"/>
-              </w:rPr>
-              <w:t xml:space="preserve">    - name: ssh</w:t>
-            </w:r>
-          </w:p>
-          <w:p>
-            <w:pPr>
-              <w:spacing w:after="0" w:before="0" w:line="240"/>
-            </w:pPr>
-            <w:r>
-              <w:rPr>
-                <w:rFonts w:ascii="Consolas" w:cs="Consolas" w:eastAsia="Consolas" w:hAnsi="Consolas"/>
-                <w:sz w:val="15"/>
-                <w:szCs w:val="15"/>
-              </w:rPr>
-              <w:t xml:space="preserve">      port: 2222</w:t>
-            </w:r>
-          </w:p>
-          <w:p>
-            <w:pPr>
-              <w:spacing w:after="0" w:before="0" w:line="240"/>
-            </w:pPr>
-            <w:r>
-              <w:rPr>
-                <w:rFonts w:ascii="Consolas" w:cs="Consolas" w:eastAsia="Consolas" w:hAnsi="Consolas"/>
-                <w:sz w:val="15"/>
-                <w:szCs w:val="15"/>
-              </w:rPr>
-              <w:t xml:space="preserve">      targetPort: 2222</w:t>
-            </w:r>
-          </w:p>
-          <w:p>
-            <w:pPr>
-              <w:spacing w:after="0" w:before="0" w:line="240"/>
-            </w:pPr>
-            <w:r>
-              <w:rPr>
-                <w:rFonts w:ascii="Consolas" w:cs="Consolas" w:eastAsia="Consolas" w:hAnsi="Consolas"/>
-                <w:sz w:val="15"/>
-                <w:szCs w:val="15"/>
-              </w:rPr>
-              <w:t xml:space="preserve">      nodePort: 32222</w:t>
+                <w:sz w:val="14"/>
+                <w:szCs w:val="14"/>
+              </w:rPr>
+              <w:t xml:space="preserve">    matchLabels:</w:t>
+            </w:r>
+          </w:p>
+          <w:p>
+            <w:pPr>
+              <w:spacing w:after="0" w:before="0" w:line="240"/>
+            </w:pPr>
+            <w:r>
+              <w:rPr>
+                <w:rFonts w:ascii="Consolas" w:cs="Consolas" w:eastAsia="Consolas" w:hAnsi="Consolas"/>
+                <w:sz w:val="14"/>
+                <w:szCs w:val="14"/>
+              </w:rPr>
+              <w:t xml:space="preserve">      app.kubernetes.io/name: devpod-nodeport</w:t>
+            </w:r>
+          </w:p>
+          <w:p>
+            <w:pPr>
+              <w:spacing w:after="0" w:before="0" w:line="240"/>
+            </w:pPr>
+            <w:r>
+              <w:rPr>
+                <w:rFonts w:ascii="Consolas" w:cs="Consolas" w:eastAsia="Consolas" w:hAnsi="Consolas"/>
+                <w:sz w:val="14"/>
+                <w:szCs w:val="14"/>
+              </w:rPr>
+              <w:t xml:space="preserve">  template:</w:t>
+            </w:r>
+          </w:p>
+          <w:p>
+            <w:pPr>
+              <w:spacing w:after="0" w:before="0" w:line="240"/>
+            </w:pPr>
+            <w:r>
+              <w:rPr>
+                <w:rFonts w:ascii="Consolas" w:cs="Consolas" w:eastAsia="Consolas" w:hAnsi="Consolas"/>
+                <w:sz w:val="14"/>
+                <w:szCs w:val="14"/>
+              </w:rPr>
+              <w:t xml:space="preserve">    metadata:</w:t>
+            </w:r>
+          </w:p>
+          <w:p>
+            <w:pPr>
+              <w:spacing w:after="0" w:before="0" w:line="240"/>
+            </w:pPr>
+            <w:r>
+              <w:rPr>
+                <w:rFonts w:ascii="Consolas" w:cs="Consolas" w:eastAsia="Consolas" w:hAnsi="Consolas"/>
+                <w:sz w:val="14"/>
+                <w:szCs w:val="14"/>
+              </w:rPr>
+              <w:t xml:space="preserve">      labels:</w:t>
+            </w:r>
+          </w:p>
+          <w:p>
+            <w:pPr>
+              <w:spacing w:after="0" w:before="0" w:line="240"/>
+            </w:pPr>
+            <w:r>
+              <w:rPr>
+                <w:rFonts w:ascii="Consolas" w:cs="Consolas" w:eastAsia="Consolas" w:hAnsi="Consolas"/>
+                <w:sz w:val="14"/>
+                <w:szCs w:val="14"/>
+              </w:rPr>
+              <w:t xml:space="preserve">        app.kubernetes.io/name: devpod-nodeport</w:t>
+            </w:r>
+          </w:p>
+          <w:p>
+            <w:pPr>
+              <w:spacing w:after="0" w:before="0" w:line="240"/>
+            </w:pPr>
+            <w:r>
+              <w:rPr>
+                <w:rFonts w:ascii="Consolas" w:cs="Consolas" w:eastAsia="Consolas" w:hAnsi="Consolas"/>
+                <w:sz w:val="14"/>
+                <w:szCs w:val="14"/>
+              </w:rPr>
+              <w:t xml:space="preserve">        app.kubernetes.io/part-of: homelab-dev</w:t>
+            </w:r>
+          </w:p>
+          <w:p>
+            <w:pPr>
+              <w:spacing w:after="0" w:before="0" w:line="240"/>
+            </w:pPr>
+            <w:r>
+              <w:rPr>
+                <w:rFonts w:ascii="Consolas" w:cs="Consolas" w:eastAsia="Consolas" w:hAnsi="Consolas"/>
+                <w:sz w:val="14"/>
+                <w:szCs w:val="14"/>
+              </w:rPr>
+              <w:t xml:space="preserve">    spec:</w:t>
+            </w:r>
+          </w:p>
+          <w:p>
+            <w:pPr>
+              <w:spacing w:after="0" w:before="0" w:line="240"/>
+            </w:pPr>
+            <w:r>
+              <w:rPr>
+                <w:rFonts w:ascii="Consolas" w:cs="Consolas" w:eastAsia="Consolas" w:hAnsi="Consolas"/>
+                <w:sz w:val="14"/>
+                <w:szCs w:val="14"/>
+              </w:rPr>
+              <w:t xml:space="preserve">      serviceAccountName: devpod-nodeport</w:t>
+            </w:r>
+          </w:p>
+          <w:p>
+            <w:pPr>
+              <w:spacing w:after="0" w:before="0" w:line="240"/>
+            </w:pPr>
+            <w:r>
+              <w:rPr>
+                <w:rFonts w:ascii="Consolas" w:cs="Consolas" w:eastAsia="Consolas" w:hAnsi="Consolas"/>
+                <w:sz w:val="14"/>
+                <w:szCs w:val="14"/>
+              </w:rPr>
+              <w:t xml:space="preserve">      affinity:</w:t>
+            </w:r>
+          </w:p>
+          <w:p>
+            <w:pPr>
+              <w:spacing w:after="0" w:before="0" w:line="240"/>
+            </w:pPr>
+            <w:r>
+              <w:rPr>
+                <w:rFonts w:ascii="Consolas" w:cs="Consolas" w:eastAsia="Consolas" w:hAnsi="Consolas"/>
+                <w:sz w:val="14"/>
+                <w:szCs w:val="14"/>
+              </w:rPr>
+              <w:t xml:space="preserve">        nodeAffinity:</w:t>
+            </w:r>
+          </w:p>
+          <w:p>
+            <w:pPr>
+              <w:spacing w:after="0" w:before="0" w:line="240"/>
+            </w:pPr>
+            <w:r>
+              <w:rPr>
+                <w:rFonts w:ascii="Consolas" w:cs="Consolas" w:eastAsia="Consolas" w:hAnsi="Consolas"/>
+                <w:sz w:val="14"/>
+                <w:szCs w:val="14"/>
+              </w:rPr>
+              <w:t xml:space="preserve">          requiredDuringSchedulingIgnoredDuringExecution:</w:t>
+            </w:r>
+          </w:p>
+          <w:p>
+            <w:pPr>
+              <w:spacing w:after="0" w:before="0" w:line="240"/>
+            </w:pPr>
+            <w:r>
+              <w:rPr>
+                <w:rFonts w:ascii="Consolas" w:cs="Consolas" w:eastAsia="Consolas" w:hAnsi="Consolas"/>
+                <w:sz w:val="14"/>
+                <w:szCs w:val="14"/>
+              </w:rPr>
+              <w:t xml:space="preserve">            nodeSelectorTerms:</w:t>
+            </w:r>
+          </w:p>
+          <w:p>
+            <w:pPr>
+              <w:spacing w:after="0" w:before="0" w:line="240"/>
+            </w:pPr>
+            <w:r>
+              <w:rPr>
+                <w:rFonts w:ascii="Consolas" w:cs="Consolas" w:eastAsia="Consolas" w:hAnsi="Consolas"/>
+                <w:sz w:val="14"/>
+                <w:szCs w:val="14"/>
+              </w:rPr>
+              <w:t xml:space="preserve">              - matchExpressions:</w:t>
+            </w:r>
+          </w:p>
+          <w:p>
+            <w:pPr>
+              <w:spacing w:after="0" w:before="0" w:line="240"/>
+            </w:pPr>
+            <w:r>
+              <w:rPr>
+                <w:rFonts w:ascii="Consolas" w:cs="Consolas" w:eastAsia="Consolas" w:hAnsi="Consolas"/>
+                <w:sz w:val="14"/>
+                <w:szCs w:val="14"/>
+              </w:rPr>
+              <w:t xml:space="preserve">                  - key: kubernetes.io/hostname</w:t>
+            </w:r>
+          </w:p>
+          <w:p>
+            <w:pPr>
+              <w:spacing w:after="0" w:before="0" w:line="240"/>
+            </w:pPr>
+            <w:r>
+              <w:rPr>
+                <w:rFonts w:ascii="Consolas" w:cs="Consolas" w:eastAsia="Consolas" w:hAnsi="Consolas"/>
+                <w:sz w:val="14"/>
+                <w:szCs w:val="14"/>
+              </w:rPr>
+              <w:t xml:space="preserve">                    operator: In</w:t>
+            </w:r>
+          </w:p>
+          <w:p>
+            <w:pPr>
+              <w:spacing w:after="0" w:before="0" w:line="240"/>
+            </w:pPr>
+            <w:r>
+              <w:rPr>
+                <w:rFonts w:ascii="Consolas" w:cs="Consolas" w:eastAsia="Consolas" w:hAnsi="Consolas"/>
+                <w:sz w:val="14"/>
+                <w:szCs w:val="14"/>
+              </w:rPr>
+              <w:t xml:space="preserve">                    values: [skynet-wrk-01, skynet-wrk-02, skynet-wrk-03]</w:t>
+            </w:r>
+          </w:p>
+          <w:p>
+            <w:pPr>
+              <w:spacing w:after="0" w:before="0" w:line="240"/>
+            </w:pPr>
+            <w:r>
+              <w:rPr>
+                <w:rFonts w:ascii="Consolas" w:cs="Consolas" w:eastAsia="Consolas" w:hAnsi="Consolas"/>
+                <w:sz w:val="14"/>
+                <w:szCs w:val="14"/>
+              </w:rPr>
+              <w:t xml:space="preserve">      containers:</w:t>
+            </w:r>
+          </w:p>
+          <w:p>
+            <w:pPr>
+              <w:spacing w:after="0" w:before="0" w:line="240"/>
+            </w:pPr>
+            <w:r>
+              <w:rPr>
+                <w:rFonts w:ascii="Consolas" w:cs="Consolas" w:eastAsia="Consolas" w:hAnsi="Consolas"/>
+                <w:sz w:val="14"/>
+                <w:szCs w:val="14"/>
+              </w:rPr>
+              <w:t xml:space="preserve">        - name: reconciler</w:t>
+            </w:r>
+          </w:p>
+          <w:p>
+            <w:pPr>
+              <w:spacing w:after="0" w:before="0" w:line="240"/>
+            </w:pPr>
+            <w:r>
+              <w:rPr>
+                <w:rFonts w:ascii="Consolas" w:cs="Consolas" w:eastAsia="Consolas" w:hAnsi="Consolas"/>
+                <w:sz w:val="14"/>
+                <w:szCs w:val="14"/>
+              </w:rPr>
+              <w:t xml:space="preserve">          image: alpine/k8s:1.32.9</w:t>
+            </w:r>
+          </w:p>
+          <w:p>
+            <w:pPr>
+              <w:spacing w:after="0" w:before="0" w:line="240"/>
+            </w:pPr>
+            <w:r>
+              <w:rPr>
+                <w:rFonts w:ascii="Consolas" w:cs="Consolas" w:eastAsia="Consolas" w:hAnsi="Consolas"/>
+                <w:sz w:val="14"/>
+                <w:szCs w:val="14"/>
+              </w:rPr>
+              <w:t xml:space="preserve">          imagePullPolicy: IfNotPresent</w:t>
+            </w:r>
+          </w:p>
+          <w:p>
+            <w:pPr>
+              <w:spacing w:after="0" w:before="0" w:line="240"/>
+            </w:pPr>
+            <w:r>
+              <w:rPr>
+                <w:rFonts w:ascii="Consolas" w:cs="Consolas" w:eastAsia="Consolas" w:hAnsi="Consolas"/>
+                <w:sz w:val="14"/>
+                <w:szCs w:val="14"/>
+              </w:rPr>
+              <w:t xml:space="preserve">          command: ["/bin/sh", "-c"]</w:t>
+            </w:r>
+          </w:p>
+          <w:p>
+            <w:pPr>
+              <w:spacing w:after="0" w:before="0" w:line="240"/>
+            </w:pPr>
+            <w:r>
+              <w:rPr>
+                <w:rFonts w:ascii="Consolas" w:cs="Consolas" w:eastAsia="Consolas" w:hAnsi="Consolas"/>
+                <w:sz w:val="14"/>
+                <w:szCs w:val="14"/>
+              </w:rPr>
+              <w:t xml:space="preserve">          args:</w:t>
+            </w:r>
+          </w:p>
+          <w:p>
+            <w:pPr>
+              <w:spacing w:after="0" w:before="0" w:line="240"/>
+            </w:pPr>
+            <w:r>
+              <w:rPr>
+                <w:rFonts w:ascii="Consolas" w:cs="Consolas" w:eastAsia="Consolas" w:hAnsi="Consolas"/>
+                <w:sz w:val="14"/>
+                <w:szCs w:val="14"/>
+              </w:rPr>
+              <w:t xml:space="preserve">            - |</w:t>
+            </w:r>
+          </w:p>
+          <w:p>
+            <w:pPr>
+              <w:spacing w:after="0" w:before="0" w:line="240"/>
+            </w:pPr>
+            <w:r>
+              <w:rPr>
+                <w:rFonts w:ascii="Consolas" w:cs="Consolas" w:eastAsia="Consolas" w:hAnsi="Consolas"/>
+                <w:sz w:val="14"/>
+                <w:szCs w:val="14"/>
+              </w:rPr>
+              <w:t xml:space="preserve">              set -u</w:t>
+            </w:r>
+          </w:p>
+          <w:p>
+            <w:pPr>
+              <w:spacing w:after="0" w:before="0" w:line="240"/>
+            </w:pPr>
+            <w:r>
+              <w:rPr>
+                <w:rFonts w:ascii="Consolas" w:cs="Consolas" w:eastAsia="Consolas" w:hAnsi="Consolas"/>
+                <w:sz w:val="14"/>
+                <w:szCs w:val="14"/>
+              </w:rPr>
+              <w:t xml:space="preserve">              ns=devpod</w:t>
+            </w:r>
+          </w:p>
+          <w:p>
+            <w:pPr>
+              <w:spacing w:after="0" w:before="0" w:line="240"/>
+            </w:pPr>
+            <w:r>
+              <w:rPr>
+                <w:rFonts w:ascii="Consolas" w:cs="Consolas" w:eastAsia="Consolas" w:hAnsi="Consolas"/>
+                <w:sz w:val="14"/>
+                <w:szCs w:val="14"/>
+              </w:rPr>
+              <w:t xml:space="preserve">              sts=devpod</w:t>
+            </w:r>
+          </w:p>
+          <w:p>
+            <w:pPr>
+              <w:spacing w:after="0" w:before="0" w:line="240"/>
+            </w:pPr>
+            <w:r>
+              <w:rPr>
+                <w:rFonts w:ascii="Consolas" w:cs="Consolas" w:eastAsia="Consolas" w:hAnsi="Consolas"/>
+                <w:sz w:val="14"/>
+                <w:szCs w:val="14"/>
+              </w:rPr>
+              <w:t xml:space="preserve">              base=32222</w:t>
+            </w:r>
+          </w:p>
+          <w:p>
+            <w:pPr>
+              <w:spacing w:after="0" w:before="0" w:line="240"/>
+            </w:pPr>
+            <w:r>
+              <w:rPr>
+                <w:rFonts w:ascii="Consolas" w:cs="Consolas" w:eastAsia="Consolas" w:hAnsi="Consolas"/>
+                <w:sz w:val="14"/>
+                <w:szCs w:val="14"/>
+              </w:rPr>
+              <w:t xml:space="preserve">              while true; do</w:t>
+            </w:r>
+          </w:p>
+          <w:p>
+            <w:pPr>
+              <w:spacing w:after="0" w:before="0" w:line="240"/>
+            </w:pPr>
+            <w:r>
+              <w:rPr>
+                <w:rFonts w:ascii="Consolas" w:cs="Consolas" w:eastAsia="Consolas" w:hAnsi="Consolas"/>
+                <w:sz w:val="14"/>
+                <w:szCs w:val="14"/>
+              </w:rPr>
+              <w:t xml:space="preserve">                replicas="$(kubectl -n "$ns" get sts "$sts" -o jsonpath='{.spec.replicas}' 2&gt;/dev/null || true)"</w:t>
+            </w:r>
+          </w:p>
+          <w:p>
+            <w:pPr>
+              <w:spacing w:after="0" w:before="0" w:line="240"/>
+            </w:pPr>
+            <w:r>
+              <w:rPr>
+                <w:rFonts w:ascii="Consolas" w:cs="Consolas" w:eastAsia="Consolas" w:hAnsi="Consolas"/>
+                <w:sz w:val="14"/>
+                <w:szCs w:val="14"/>
+              </w:rPr>
+              <w:t xml:space="preserve">                uid="$(kubectl -n "$ns" get sts "$sts" -o jsonpath='{.metadata.uid}' 2&gt;/dev/null || true)"</w:t>
+            </w:r>
+          </w:p>
+          <w:p>
+            <w:pPr>
+              <w:spacing w:after="0" w:before="0" w:line="240"/>
+            </w:pPr>
+            <w:r>
+              <w:rPr>
+                <w:rFonts w:ascii="Consolas" w:cs="Consolas" w:eastAsia="Consolas" w:hAnsi="Consolas"/>
+                <w:sz w:val="14"/>
+                <w:szCs w:val="14"/>
+              </w:rPr>
+              <w:t xml:space="preserve">                if [ -z "$replicas" ] || [ -z "$uid" ]; then</w:t>
+            </w:r>
+          </w:p>
+          <w:p>
+            <w:pPr>
+              <w:spacing w:after="0" w:before="0" w:line="240"/>
+            </w:pPr>
+            <w:r>
+              <w:rPr>
+                <w:rFonts w:ascii="Consolas" w:cs="Consolas" w:eastAsia="Consolas" w:hAnsi="Consolas"/>
+                <w:sz w:val="14"/>
+                <w:szCs w:val="14"/>
+              </w:rPr>
+              <w:t xml:space="preserve">                  echo "statefulset $sts not found"</w:t>
+            </w:r>
+          </w:p>
+          <w:p>
+            <w:pPr>
+              <w:spacing w:after="0" w:before="0" w:line="240"/>
+            </w:pPr>
+            <w:r>
+              <w:rPr>
+                <w:rFonts w:ascii="Consolas" w:cs="Consolas" w:eastAsia="Consolas" w:hAnsi="Consolas"/>
+                <w:sz w:val="14"/>
+                <w:szCs w:val="14"/>
+              </w:rPr>
+              <w:t xml:space="preserve">                  sleep 20</w:t>
+            </w:r>
+          </w:p>
+          <w:p>
+            <w:pPr>
+              <w:spacing w:after="0" w:before="0" w:line="240"/>
+            </w:pPr>
+            <w:r>
+              <w:rPr>
+                <w:rFonts w:ascii="Consolas" w:cs="Consolas" w:eastAsia="Consolas" w:hAnsi="Consolas"/>
+                <w:sz w:val="14"/>
+                <w:szCs w:val="14"/>
+              </w:rPr>
+              <w:t xml:space="preserve">                  continue</w:t>
+            </w:r>
+          </w:p>
+          <w:p>
+            <w:pPr>
+              <w:spacing w:after="0" w:before="0" w:line="240"/>
+            </w:pPr>
+            <w:r>
+              <w:rPr>
+                <w:rFonts w:ascii="Consolas" w:cs="Consolas" w:eastAsia="Consolas" w:hAnsi="Consolas"/>
+                <w:sz w:val="14"/>
+                <w:szCs w:val="14"/>
+              </w:rPr>
+              <w:t xml:space="preserve">                fi</w:t>
+            </w:r>
+          </w:p>
+          <w:p>
+            <w:pPr>
+              <w:spacing w:after="0" w:before="0" w:line="240"/>
+            </w:pPr>
+            <w:r>
+              <w:rPr>
+                <w:rFonts w:ascii="Consolas" w:cs="Consolas" w:eastAsia="Consolas" w:hAnsi="Consolas"/>
+                <w:sz w:val="14"/>
+                <w:szCs w:val="14"/>
+              </w:rPr>
+              <w:t xml:space="preserve">                i=0</w:t>
+            </w:r>
+          </w:p>
+          <w:p>
+            <w:pPr>
+              <w:spacing w:after="0" w:before="0" w:line="240"/>
+            </w:pPr>
+            <w:r>
+              <w:rPr>
+                <w:rFonts w:ascii="Consolas" w:cs="Consolas" w:eastAsia="Consolas" w:hAnsi="Consolas"/>
+                <w:sz w:val="14"/>
+                <w:szCs w:val="14"/>
+              </w:rPr>
+              <w:t xml:space="preserve">                while [ "$i" -lt "$replicas" ]; do</w:t>
+            </w:r>
+          </w:p>
+          <w:p>
+            <w:pPr>
+              <w:spacing w:after="0" w:before="0" w:line="240"/>
+            </w:pPr>
+            <w:r>
+              <w:rPr>
+                <w:rFonts w:ascii="Consolas" w:cs="Consolas" w:eastAsia="Consolas" w:hAnsi="Consolas"/>
+                <w:sz w:val="14"/>
+                <w:szCs w:val="14"/>
+              </w:rPr>
+              <w:t xml:space="preserve">                  name="devpod-${i}-ssh"</w:t>
+            </w:r>
+          </w:p>
+          <w:p>
+            <w:pPr>
+              <w:spacing w:after="0" w:before="0" w:line="240"/>
+            </w:pPr>
+            <w:r>
+              <w:rPr>
+                <w:rFonts w:ascii="Consolas" w:cs="Consolas" w:eastAsia="Consolas" w:hAnsi="Consolas"/>
+                <w:sz w:val="14"/>
+                <w:szCs w:val="14"/>
+              </w:rPr>
+              <w:t xml:space="preserve">                  port="$((base + i))"</w:t>
+            </w:r>
+          </w:p>
+          <w:p>
+            <w:pPr>
+              <w:spacing w:after="0" w:before="0" w:line="240"/>
+            </w:pPr>
+            <w:r>
+              <w:rPr>
+                <w:rFonts w:ascii="Consolas" w:cs="Consolas" w:eastAsia="Consolas" w:hAnsi="Consolas"/>
+                <w:sz w:val="14"/>
+                <w:szCs w:val="14"/>
+              </w:rPr>
+              <w:t xml:space="preserve">                  printf '%s\n' \</w:t>
+            </w:r>
+          </w:p>
+          <w:p>
+            <w:pPr>
+              <w:spacing w:after="0" w:before="0" w:line="240"/>
+            </w:pPr>
+            <w:r>
+              <w:rPr>
+                <w:rFonts w:ascii="Consolas" w:cs="Consolas" w:eastAsia="Consolas" w:hAnsi="Consolas"/>
+                <w:sz w:val="14"/>
+                <w:szCs w:val="14"/>
+              </w:rPr>
+              <w:t xml:space="preserve">                    'apiVersion: v1' \</w:t>
+            </w:r>
+          </w:p>
+          <w:p>
+            <w:pPr>
+              <w:spacing w:after="0" w:before="0" w:line="240"/>
+            </w:pPr>
+            <w:r>
+              <w:rPr>
+                <w:rFonts w:ascii="Consolas" w:cs="Consolas" w:eastAsia="Consolas" w:hAnsi="Consolas"/>
+                <w:sz w:val="14"/>
+                <w:szCs w:val="14"/>
+              </w:rPr>
+              <w:t xml:space="preserve">                    'kind: Service' \</w:t>
+            </w:r>
+          </w:p>
+          <w:p>
+            <w:pPr>
+              <w:spacing w:after="0" w:before="0" w:line="240"/>
+            </w:pPr>
+            <w:r>
+              <w:rPr>
+                <w:rFonts w:ascii="Consolas" w:cs="Consolas" w:eastAsia="Consolas" w:hAnsi="Consolas"/>
+                <w:sz w:val="14"/>
+                <w:szCs w:val="14"/>
+              </w:rPr>
+              <w:t xml:space="preserve">                    'metadata:' \</w:t>
+            </w:r>
+          </w:p>
+          <w:p>
+            <w:pPr>
+              <w:spacing w:after="0" w:before="0" w:line="240"/>
+            </w:pPr>
+            <w:r>
+              <w:rPr>
+                <w:rFonts w:ascii="Consolas" w:cs="Consolas" w:eastAsia="Consolas" w:hAnsi="Consolas"/>
+                <w:sz w:val="14"/>
+                <w:szCs w:val="14"/>
+              </w:rPr>
+              <w:t xml:space="preserve">                    "  name: ${name}" \</w:t>
+            </w:r>
+          </w:p>
+          <w:p>
+            <w:pPr>
+              <w:spacing w:after="0" w:before="0" w:line="240"/>
+            </w:pPr>
+            <w:r>
+              <w:rPr>
+                <w:rFonts w:ascii="Consolas" w:cs="Consolas" w:eastAsia="Consolas" w:hAnsi="Consolas"/>
+                <w:sz w:val="14"/>
+                <w:szCs w:val="14"/>
+              </w:rPr>
+              <w:t xml:space="preserve">                    "  namespace: ${ns}" \</w:t>
+            </w:r>
+          </w:p>
+          <w:p>
+            <w:pPr>
+              <w:spacing w:after="0" w:before="0" w:line="240"/>
+            </w:pPr>
+            <w:r>
+              <w:rPr>
+                <w:rFonts w:ascii="Consolas" w:cs="Consolas" w:eastAsia="Consolas" w:hAnsi="Consolas"/>
+                <w:sz w:val="14"/>
+                <w:szCs w:val="14"/>
+              </w:rPr>
+              <w:t xml:space="preserve">                    '  labels:' \</w:t>
+            </w:r>
+          </w:p>
+          <w:p>
+            <w:pPr>
+              <w:spacing w:after="0" w:before="0" w:line="240"/>
+            </w:pPr>
+            <w:r>
+              <w:rPr>
+                <w:rFonts w:ascii="Consolas" w:cs="Consolas" w:eastAsia="Consolas" w:hAnsi="Consolas"/>
+                <w:sz w:val="14"/>
+                <w:szCs w:val="14"/>
+              </w:rPr>
+              <w:t xml:space="preserve">                    '    app.kubernetes.io/name: devpod' \</w:t>
+            </w:r>
+          </w:p>
+          <w:p>
+            <w:pPr>
+              <w:spacing w:after="0" w:before="0" w:line="240"/>
+            </w:pPr>
+            <w:r>
+              <w:rPr>
+                <w:rFonts w:ascii="Consolas" w:cs="Consolas" w:eastAsia="Consolas" w:hAnsi="Consolas"/>
+                <w:sz w:val="14"/>
+                <w:szCs w:val="14"/>
+              </w:rPr>
+              <w:t xml:space="preserve">                    '    app.kubernetes.io/part-of: homelab-dev' \</w:t>
+            </w:r>
+          </w:p>
+          <w:p>
+            <w:pPr>
+              <w:spacing w:after="0" w:before="0" w:line="240"/>
+            </w:pPr>
+            <w:r>
+              <w:rPr>
+                <w:rFonts w:ascii="Consolas" w:cs="Consolas" w:eastAsia="Consolas" w:hAnsi="Consolas"/>
+                <w:sz w:val="14"/>
+                <w:szCs w:val="14"/>
+              </w:rPr>
+              <w:t xml:space="preserve">                    '    app.kubernetes.io/managed-by: devpod-nodeport' \</w:t>
+            </w:r>
+          </w:p>
+          <w:p>
+            <w:pPr>
+              <w:spacing w:after="0" w:before="0" w:line="240"/>
+            </w:pPr>
+            <w:r>
+              <w:rPr>
+                <w:rFonts w:ascii="Consolas" w:cs="Consolas" w:eastAsia="Consolas" w:hAnsi="Consolas"/>
+                <w:sz w:val="14"/>
+                <w:szCs w:val="14"/>
+              </w:rPr>
+              <w:t xml:space="preserve">                    '  ownerReferences:' \</w:t>
+            </w:r>
+          </w:p>
+          <w:p>
+            <w:pPr>
+              <w:spacing w:after="0" w:before="0" w:line="240"/>
+            </w:pPr>
+            <w:r>
+              <w:rPr>
+                <w:rFonts w:ascii="Consolas" w:cs="Consolas" w:eastAsia="Consolas" w:hAnsi="Consolas"/>
+                <w:sz w:val="14"/>
+                <w:szCs w:val="14"/>
+              </w:rPr>
+              <w:t xml:space="preserve">                    '    - apiVersion: apps/v1' \</w:t>
+            </w:r>
+          </w:p>
+          <w:p>
+            <w:pPr>
+              <w:spacing w:after="0" w:before="0" w:line="240"/>
+            </w:pPr>
+            <w:r>
+              <w:rPr>
+                <w:rFonts w:ascii="Consolas" w:cs="Consolas" w:eastAsia="Consolas" w:hAnsi="Consolas"/>
+                <w:sz w:val="14"/>
+                <w:szCs w:val="14"/>
+              </w:rPr>
+              <w:t xml:space="preserve">                    '      kind: StatefulSet' \</w:t>
+            </w:r>
+          </w:p>
+          <w:p>
+            <w:pPr>
+              <w:spacing w:after="0" w:before="0" w:line="240"/>
+            </w:pPr>
+            <w:r>
+              <w:rPr>
+                <w:rFonts w:ascii="Consolas" w:cs="Consolas" w:eastAsia="Consolas" w:hAnsi="Consolas"/>
+                <w:sz w:val="14"/>
+                <w:szCs w:val="14"/>
+              </w:rPr>
+              <w:t xml:space="preserve">                    "      name: ${sts}" \</w:t>
+            </w:r>
+          </w:p>
+          <w:p>
+            <w:pPr>
+              <w:spacing w:after="0" w:before="0" w:line="240"/>
+            </w:pPr>
+            <w:r>
+              <w:rPr>
+                <w:rFonts w:ascii="Consolas" w:cs="Consolas" w:eastAsia="Consolas" w:hAnsi="Consolas"/>
+                <w:sz w:val="14"/>
+                <w:szCs w:val="14"/>
+              </w:rPr>
+              <w:t xml:space="preserve">                    "      uid: ${uid}" \</w:t>
+            </w:r>
+          </w:p>
+          <w:p>
+            <w:pPr>
+              <w:spacing w:after="0" w:before="0" w:line="240"/>
+            </w:pPr>
+            <w:r>
+              <w:rPr>
+                <w:rFonts w:ascii="Consolas" w:cs="Consolas" w:eastAsia="Consolas" w:hAnsi="Consolas"/>
+                <w:sz w:val="14"/>
+                <w:szCs w:val="14"/>
+              </w:rPr>
+              <w:t xml:space="preserve">                    'spec:' \</w:t>
+            </w:r>
+          </w:p>
+          <w:p>
+            <w:pPr>
+              <w:spacing w:after="0" w:before="0" w:line="240"/>
+            </w:pPr>
+            <w:r>
+              <w:rPr>
+                <w:rFonts w:ascii="Consolas" w:cs="Consolas" w:eastAsia="Consolas" w:hAnsi="Consolas"/>
+                <w:sz w:val="14"/>
+                <w:szCs w:val="14"/>
+              </w:rPr>
+              <w:t xml:space="preserve">                    '  type: NodePort' \</w:t>
+            </w:r>
+          </w:p>
+          <w:p>
+            <w:pPr>
+              <w:spacing w:after="0" w:before="0" w:line="240"/>
+            </w:pPr>
+            <w:r>
+              <w:rPr>
+                <w:rFonts w:ascii="Consolas" w:cs="Consolas" w:eastAsia="Consolas" w:hAnsi="Consolas"/>
+                <w:sz w:val="14"/>
+                <w:szCs w:val="14"/>
+              </w:rPr>
+              <w:t xml:space="preserve">                    '  selector:' \</w:t>
+            </w:r>
+          </w:p>
+          <w:p>
+            <w:pPr>
+              <w:spacing w:after="0" w:before="0" w:line="240"/>
+            </w:pPr>
+            <w:r>
+              <w:rPr>
+                <w:rFonts w:ascii="Consolas" w:cs="Consolas" w:eastAsia="Consolas" w:hAnsi="Consolas"/>
+                <w:sz w:val="14"/>
+                <w:szCs w:val="14"/>
+              </w:rPr>
+              <w:t xml:space="preserve">                    "    statefulset.kubernetes.io/pod-name: devpod-${i}" \</w:t>
+            </w:r>
+          </w:p>
+          <w:p>
+            <w:pPr>
+              <w:spacing w:after="0" w:before="0" w:line="240"/>
+            </w:pPr>
+            <w:r>
+              <w:rPr>
+                <w:rFonts w:ascii="Consolas" w:cs="Consolas" w:eastAsia="Consolas" w:hAnsi="Consolas"/>
+                <w:sz w:val="14"/>
+                <w:szCs w:val="14"/>
+              </w:rPr>
+              <w:t xml:space="preserve">                    '  ports:' \</w:t>
+            </w:r>
+          </w:p>
+          <w:p>
+            <w:pPr>
+              <w:spacing w:after="0" w:before="0" w:line="240"/>
+            </w:pPr>
+            <w:r>
+              <w:rPr>
+                <w:rFonts w:ascii="Consolas" w:cs="Consolas" w:eastAsia="Consolas" w:hAnsi="Consolas"/>
+                <w:sz w:val="14"/>
+                <w:szCs w:val="14"/>
+              </w:rPr>
+              <w:t xml:space="preserve">                    '    - name: ssh' \</w:t>
+            </w:r>
+          </w:p>
+          <w:p>
+            <w:pPr>
+              <w:spacing w:after="0" w:before="0" w:line="240"/>
+            </w:pPr>
+            <w:r>
+              <w:rPr>
+                <w:rFonts w:ascii="Consolas" w:cs="Consolas" w:eastAsia="Consolas" w:hAnsi="Consolas"/>
+                <w:sz w:val="14"/>
+                <w:szCs w:val="14"/>
+              </w:rPr>
+              <w:t xml:space="preserve">                    '      port: 2222' \</w:t>
+            </w:r>
+          </w:p>
+          <w:p>
+            <w:pPr>
+              <w:spacing w:after="0" w:before="0" w:line="240"/>
+            </w:pPr>
+            <w:r>
+              <w:rPr>
+                <w:rFonts w:ascii="Consolas" w:cs="Consolas" w:eastAsia="Consolas" w:hAnsi="Consolas"/>
+                <w:sz w:val="14"/>
+                <w:szCs w:val="14"/>
+              </w:rPr>
+              <w:t xml:space="preserve">                    '      targetPort: 2222' \</w:t>
+            </w:r>
+          </w:p>
+          <w:p>
+            <w:pPr>
+              <w:spacing w:after="0" w:before="0" w:line="240"/>
+            </w:pPr>
+            <w:r>
+              <w:rPr>
+                <w:rFonts w:ascii="Consolas" w:cs="Consolas" w:eastAsia="Consolas" w:hAnsi="Consolas"/>
+                <w:sz w:val="14"/>
+                <w:szCs w:val="14"/>
+              </w:rPr>
+              <w:t xml:space="preserve">                    "      nodePort: ${port}" \</w:t>
+            </w:r>
+          </w:p>
+          <w:p>
+            <w:pPr>
+              <w:spacing w:after="0" w:before="0" w:line="240"/>
+            </w:pPr>
+            <w:r>
+              <w:rPr>
+                <w:rFonts w:ascii="Consolas" w:cs="Consolas" w:eastAsia="Consolas" w:hAnsi="Consolas"/>
+                <w:sz w:val="14"/>
+                <w:szCs w:val="14"/>
+              </w:rPr>
+              <w:t xml:space="preserve">                    | kubectl -n "$ns" apply -f -</w:t>
+            </w:r>
+          </w:p>
+          <w:p>
+            <w:pPr>
+              <w:spacing w:after="0" w:before="0" w:line="240"/>
+            </w:pPr>
+            <w:r>
+              <w:rPr>
+                <w:rFonts w:ascii="Consolas" w:cs="Consolas" w:eastAsia="Consolas" w:hAnsi="Consolas"/>
+                <w:sz w:val="14"/>
+                <w:szCs w:val="14"/>
+              </w:rPr>
+              <w:t xml:space="preserve">                  i=$((i + 1))</w:t>
+            </w:r>
+          </w:p>
+          <w:p>
+            <w:pPr>
+              <w:spacing w:after="0" w:before="0" w:line="240"/>
+            </w:pPr>
+            <w:r>
+              <w:rPr>
+                <w:rFonts w:ascii="Consolas" w:cs="Consolas" w:eastAsia="Consolas" w:hAnsi="Consolas"/>
+                <w:sz w:val="14"/>
+                <w:szCs w:val="14"/>
+              </w:rPr>
+              <w:t xml:space="preserve">                done</w:t>
+            </w:r>
+          </w:p>
+          <w:p>
+            <w:pPr>
+              <w:spacing w:after="0" w:before="0" w:line="240"/>
+            </w:pPr>
+            <w:r>
+              <w:rPr>
+                <w:rFonts w:ascii="Consolas" w:cs="Consolas" w:eastAsia="Consolas" w:hAnsi="Consolas"/>
+                <w:sz w:val="14"/>
+                <w:szCs w:val="14"/>
+              </w:rPr>
+              <w:t xml:space="preserve">                kubectl -n "$ns" get svc -l app.kubernetes.io/managed-by=devpod-nodeport -o jsonpath='{range .items[*]}{.metadata.name}{"\n"}{end}' | while read -r svcname; do</w:t>
+            </w:r>
+          </w:p>
+          <w:p>
+            <w:pPr>
+              <w:spacing w:after="0" w:before="0" w:line="240"/>
+            </w:pPr>
+            <w:r>
+              <w:rPr>
+                <w:rFonts w:ascii="Consolas" w:cs="Consolas" w:eastAsia="Consolas" w:hAnsi="Consolas"/>
+                <w:sz w:val="14"/>
+                <w:szCs w:val="14"/>
+              </w:rPr>
+              <w:t xml:space="preserve">                  [ -n "$svcname" ] || continue</w:t>
+            </w:r>
+          </w:p>
+          <w:p>
+            <w:pPr>
+              <w:spacing w:after="0" w:before="0" w:line="240"/>
+            </w:pPr>
+            <w:r>
+              <w:rPr>
+                <w:rFonts w:ascii="Consolas" w:cs="Consolas" w:eastAsia="Consolas" w:hAnsi="Consolas"/>
+                <w:sz w:val="14"/>
+                <w:szCs w:val="14"/>
+              </w:rPr>
+              <w:t xml:space="preserve">                  ordinal="${svcname#devpod-}"</w:t>
+            </w:r>
+          </w:p>
+          <w:p>
+            <w:pPr>
+              <w:spacing w:after="0" w:before="0" w:line="240"/>
+            </w:pPr>
+            <w:r>
+              <w:rPr>
+                <w:rFonts w:ascii="Consolas" w:cs="Consolas" w:eastAsia="Consolas" w:hAnsi="Consolas"/>
+                <w:sz w:val="14"/>
+                <w:szCs w:val="14"/>
+              </w:rPr>
+              <w:t xml:space="preserve">                  ordinal="${ordinal%-ssh}"</w:t>
+            </w:r>
+          </w:p>
+          <w:p>
+            <w:pPr>
+              <w:spacing w:after="0" w:before="0" w:line="240"/>
+            </w:pPr>
+            <w:r>
+              <w:rPr>
+                <w:rFonts w:ascii="Consolas" w:cs="Consolas" w:eastAsia="Consolas" w:hAnsi="Consolas"/>
+                <w:sz w:val="14"/>
+                <w:szCs w:val="14"/>
+              </w:rPr>
+              <w:t xml:space="preserve">                  case "$ordinal" in</w:t>
+            </w:r>
+          </w:p>
+          <w:p>
+            <w:pPr>
+              <w:spacing w:after="0" w:before="0" w:line="240"/>
+            </w:pPr>
+            <w:r>
+              <w:rPr>
+                <w:rFonts w:ascii="Consolas" w:cs="Consolas" w:eastAsia="Consolas" w:hAnsi="Consolas"/>
+                <w:sz w:val="14"/>
+                <w:szCs w:val="14"/>
+              </w:rPr>
+              <w:t xml:space="preserve">                    ''|*[!0-9]*) continue ;;</w:t>
+            </w:r>
+          </w:p>
+          <w:p>
+            <w:pPr>
+              <w:spacing w:after="0" w:before="0" w:line="240"/>
+            </w:pPr>
+            <w:r>
+              <w:rPr>
+                <w:rFonts w:ascii="Consolas" w:cs="Consolas" w:eastAsia="Consolas" w:hAnsi="Consolas"/>
+                <w:sz w:val="14"/>
+                <w:szCs w:val="14"/>
+              </w:rPr>
+              <w:t xml:space="preserve">                  esac</w:t>
+            </w:r>
+          </w:p>
+          <w:p>
+            <w:pPr>
+              <w:spacing w:after="0" w:before="0" w:line="240"/>
+            </w:pPr>
+            <w:r>
+              <w:rPr>
+                <w:rFonts w:ascii="Consolas" w:cs="Consolas" w:eastAsia="Consolas" w:hAnsi="Consolas"/>
+                <w:sz w:val="14"/>
+                <w:szCs w:val="14"/>
+              </w:rPr>
+              <w:t xml:space="preserve">                  if [ "$ordinal" -ge "$replicas" ]; then</w:t>
+            </w:r>
+          </w:p>
+          <w:p>
+            <w:pPr>
+              <w:spacing w:after="0" w:before="0" w:line="240"/>
+            </w:pPr>
+            <w:r>
+              <w:rPr>
+                <w:rFonts w:ascii="Consolas" w:cs="Consolas" w:eastAsia="Consolas" w:hAnsi="Consolas"/>
+                <w:sz w:val="14"/>
+                <w:szCs w:val="14"/>
+              </w:rPr>
+              <w:t xml:space="preserve">                    kubectl -n "$ns" delete svc "$svcname"</w:t>
+            </w:r>
+          </w:p>
+          <w:p>
+            <w:pPr>
+              <w:spacing w:after="0" w:before="0" w:line="240"/>
+            </w:pPr>
+            <w:r>
+              <w:rPr>
+                <w:rFonts w:ascii="Consolas" w:cs="Consolas" w:eastAsia="Consolas" w:hAnsi="Consolas"/>
+                <w:sz w:val="14"/>
+                <w:szCs w:val="14"/>
+              </w:rPr>
+              <w:t xml:space="preserve">                  fi</w:t>
+            </w:r>
+          </w:p>
+          <w:p>
+            <w:pPr>
+              <w:spacing w:after="0" w:before="0" w:line="240"/>
+            </w:pPr>
+            <w:r>
+              <w:rPr>
+                <w:rFonts w:ascii="Consolas" w:cs="Consolas" w:eastAsia="Consolas" w:hAnsi="Consolas"/>
+                <w:sz w:val="14"/>
+                <w:szCs w:val="14"/>
+              </w:rPr>
+              <w:t xml:space="preserve">                done</w:t>
+            </w:r>
+          </w:p>
+          <w:p>
+            <w:pPr>
+              <w:spacing w:after="0" w:before="0" w:line="240"/>
+            </w:pPr>
+            <w:r>
+              <w:rPr>
+                <w:rFonts w:ascii="Consolas" w:cs="Consolas" w:eastAsia="Consolas" w:hAnsi="Consolas"/>
+                <w:sz w:val="14"/>
+                <w:szCs w:val="14"/>
+              </w:rPr>
+              <w:t xml:space="preserve">                sleep 20</w:t>
+            </w:r>
+          </w:p>
+          <w:p>
+            <w:pPr>
+              <w:spacing w:after="0" w:before="0" w:line="240"/>
+            </w:pPr>
+            <w:r>
+              <w:rPr>
+                <w:rFonts w:ascii="Consolas" w:cs="Consolas" w:eastAsia="Consolas" w:hAnsi="Consolas"/>
+                <w:sz w:val="14"/>
+                <w:szCs w:val="14"/>
+              </w:rPr>
+              <w:t xml:space="preserve">              done</w:t>
+            </w:r>
+          </w:p>
+          <w:p>
+            <w:pPr>
+              <w:spacing w:after="0" w:before="0" w:line="240"/>
+            </w:pPr>
+            <w:r>
+              <w:rPr>
+                <w:rFonts w:ascii="Consolas" w:cs="Consolas" w:eastAsia="Consolas" w:hAnsi="Consolas"/>
+                <w:sz w:val="14"/>
+                <w:szCs w:val="14"/>
+              </w:rPr>
+              <w:t xml:space="preserve">          resources:</w:t>
+            </w:r>
+          </w:p>
+          <w:p>
+            <w:pPr>
+              <w:spacing w:after="0" w:before="0" w:line="240"/>
+            </w:pPr>
+            <w:r>
+              <w:rPr>
+                <w:rFonts w:ascii="Consolas" w:cs="Consolas" w:eastAsia="Consolas" w:hAnsi="Consolas"/>
+                <w:sz w:val="14"/>
+                <w:szCs w:val="14"/>
+              </w:rPr>
+              <w:t xml:space="preserve">            requests:</w:t>
+            </w:r>
+          </w:p>
+          <w:p>
+            <w:pPr>
+              <w:spacing w:after="0" w:before="0" w:line="240"/>
+            </w:pPr>
+            <w:r>
+              <w:rPr>
+                <w:rFonts w:ascii="Consolas" w:cs="Consolas" w:eastAsia="Consolas" w:hAnsi="Consolas"/>
+                <w:sz w:val="14"/>
+                <w:szCs w:val="14"/>
+              </w:rPr>
+              <w:t xml:space="preserve">              cpu: 20m</w:t>
+            </w:r>
+          </w:p>
+          <w:p>
+            <w:pPr>
+              <w:spacing w:after="0" w:before="0" w:line="240"/>
+            </w:pPr>
+            <w:r>
+              <w:rPr>
+                <w:rFonts w:ascii="Consolas" w:cs="Consolas" w:eastAsia="Consolas" w:hAnsi="Consolas"/>
+                <w:sz w:val="14"/>
+                <w:szCs w:val="14"/>
+              </w:rPr>
+              <w:t xml:space="preserve">              memory: 64Mi</w:t>
+            </w:r>
+          </w:p>
+          <w:p>
+            <w:pPr>
+              <w:spacing w:after="0" w:before="0" w:line="240"/>
+            </w:pPr>
+            <w:r>
+              <w:rPr>
+                <w:rFonts w:ascii="Consolas" w:cs="Consolas" w:eastAsia="Consolas" w:hAnsi="Consolas"/>
+                <w:sz w:val="14"/>
+                <w:szCs w:val="14"/>
+              </w:rPr>
+              <w:t xml:space="preserve">            limits:</w:t>
+            </w:r>
+          </w:p>
+          <w:p>
+            <w:pPr>
+              <w:spacing w:after="0" w:before="0" w:line="240"/>
+            </w:pPr>
+            <w:r>
+              <w:rPr>
+                <w:rFonts w:ascii="Consolas" w:cs="Consolas" w:eastAsia="Consolas" w:hAnsi="Consolas"/>
+                <w:sz w:val="14"/>
+                <w:szCs w:val="14"/>
+              </w:rPr>
+              <w:t xml:space="preserve">              cpu: 200m</w:t>
+            </w:r>
+          </w:p>
+          <w:p>
+            <w:pPr>
+              <w:spacing w:after="0" w:before="0" w:line="240"/>
+            </w:pPr>
+            <w:r>
+              <w:rPr>
+                <w:rFonts w:ascii="Consolas" w:cs="Consolas" w:eastAsia="Consolas" w:hAnsi="Consolas"/>
+                <w:sz w:val="14"/>
+                <w:szCs w:val="14"/>
+              </w:rPr>
+              <w:t xml:space="preserve">              memory: 128Mi</w:t>
             </w:r>
           </w:p>
         </w:tc>
@@ -1354,23 +2891,20 @@
           <w:sz w:val="28"/>
           <w:szCs w:val="28"/>
         </w:rPr>
-        <w:t xml:space="preserve">Appendix B. kubectl and Linux commands</w:t>
+        <w:t xml:space="preserve">4. Service the loop creates</w:t>
       </w:r>
     </w:p>
     <w:p>
       <w:pPr>
-        <w:spacing w:after="60" w:before="200"/>
+        <w:spacing w:after="120" w:before="0" w:line="276"/>
       </w:pPr>
       <w:r>
         <w:rPr>
           <w:rFonts w:ascii="Arial" w:cs="Arial" w:eastAsia="Arial" w:hAnsi="Arial"/>
-          <w:b/>
-          <w:bCs/>
-          <w:color w:val="333333"/>
-          <w:sz w:val="20"/>
-          <w:szCs w:val="20"/>
+          <w:sz w:val="22"/>
+          <w:szCs w:val="22"/>
         </w:rPr>
-        <w:t xml:space="preserve">B.1 Reconcile and confirm</w:t>
+        <w:t xml:space="preserve">Not a file in Git. Ordinal 0 is below. Ordinal 1 uses devpod-1-ssh, pod-name devpod-1, nodePort 32223.</w:t>
       </w:r>
     </w:p>
     <w:tbl>
@@ -1416,54 +2950,289 @@
             <w:r>
               <w:rPr>
                 <w:rFonts w:ascii="Consolas" w:cs="Consolas" w:eastAsia="Consolas" w:hAnsi="Consolas"/>
-                <w:sz w:val="15"/>
-                <w:szCs w:val="15"/>
-              </w:rPr>
-              <w:t xml:space="preserve">flux reconcile kustomization apps -n flux-system --with-source</w:t>
-            </w:r>
-          </w:p>
-          <w:p>
-            <w:pPr>
-              <w:spacing w:after="0" w:before="0" w:line="240"/>
-            </w:pPr>
-            <w:r>
-              <w:rPr>
-                <w:rFonts w:ascii="Consolas" w:cs="Consolas" w:eastAsia="Consolas" w:hAnsi="Consolas"/>
-                <w:sz w:val="15"/>
-                <w:szCs w:val="15"/>
-              </w:rPr>
-              <w:t xml:space="preserve">kubectl -n devpod get deploy,pod -l app.kubernetes.io/name=devpod-nodeport</w:t>
-            </w:r>
-          </w:p>
-          <w:p>
-            <w:pPr>
-              <w:spacing w:after="0" w:before="0" w:line="240"/>
-            </w:pPr>
-            <w:r>
-              <w:rPr>
-                <w:rFonts w:ascii="Consolas" w:cs="Consolas" w:eastAsia="Consolas" w:hAnsi="Consolas"/>
-                <w:sz w:val="15"/>
-                <w:szCs w:val="15"/>
-              </w:rPr>
-              <w:t xml:space="preserve">kubectl -n devpod get svc -l app.kubernetes.io/managed-by=devpod-nodeport</w:t>
-            </w:r>
-          </w:p>
-          <w:p>
-            <w:pPr>
-              <w:spacing w:after="0" w:before="0" w:line="240"/>
-            </w:pPr>
-            <w:r>
-              <w:rPr>
-                <w:rFonts w:ascii="Consolas" w:cs="Consolas" w:eastAsia="Consolas" w:hAnsi="Consolas"/>
-                <w:sz w:val="15"/>
-                <w:szCs w:val="15"/>
-              </w:rPr>
-              <w:t xml:space="preserve">kubectl -n devpod logs deploy/devpod-nodeport --tail=20</w:t>
+                <w:sz w:val="14"/>
+                <w:szCs w:val="14"/>
+              </w:rPr>
+              <w:t xml:space="preserve">apiVersion: v1</w:t>
+            </w:r>
+          </w:p>
+          <w:p>
+            <w:pPr>
+              <w:spacing w:after="0" w:before="0" w:line="240"/>
+            </w:pPr>
+            <w:r>
+              <w:rPr>
+                <w:rFonts w:ascii="Consolas" w:cs="Consolas" w:eastAsia="Consolas" w:hAnsi="Consolas"/>
+                <w:sz w:val="14"/>
+                <w:szCs w:val="14"/>
+              </w:rPr>
+              <w:t xml:space="preserve">kind: Service</w:t>
+            </w:r>
+          </w:p>
+          <w:p>
+            <w:pPr>
+              <w:spacing w:after="0" w:before="0" w:line="240"/>
+            </w:pPr>
+            <w:r>
+              <w:rPr>
+                <w:rFonts w:ascii="Consolas" w:cs="Consolas" w:eastAsia="Consolas" w:hAnsi="Consolas"/>
+                <w:sz w:val="14"/>
+                <w:szCs w:val="14"/>
+              </w:rPr>
+              <w:t xml:space="preserve">metadata:</w:t>
+            </w:r>
+          </w:p>
+          <w:p>
+            <w:pPr>
+              <w:spacing w:after="0" w:before="0" w:line="240"/>
+            </w:pPr>
+            <w:r>
+              <w:rPr>
+                <w:rFonts w:ascii="Consolas" w:cs="Consolas" w:eastAsia="Consolas" w:hAnsi="Consolas"/>
+                <w:sz w:val="14"/>
+                <w:szCs w:val="14"/>
+              </w:rPr>
+              <w:t xml:space="preserve">  name: devpod-0-ssh</w:t>
+            </w:r>
+          </w:p>
+          <w:p>
+            <w:pPr>
+              <w:spacing w:after="0" w:before="0" w:line="240"/>
+            </w:pPr>
+            <w:r>
+              <w:rPr>
+                <w:rFonts w:ascii="Consolas" w:cs="Consolas" w:eastAsia="Consolas" w:hAnsi="Consolas"/>
+                <w:sz w:val="14"/>
+                <w:szCs w:val="14"/>
+              </w:rPr>
+              <w:t xml:space="preserve">  namespace: devpod</w:t>
+            </w:r>
+          </w:p>
+          <w:p>
+            <w:pPr>
+              <w:spacing w:after="0" w:before="0" w:line="240"/>
+            </w:pPr>
+            <w:r>
+              <w:rPr>
+                <w:rFonts w:ascii="Consolas" w:cs="Consolas" w:eastAsia="Consolas" w:hAnsi="Consolas"/>
+                <w:sz w:val="14"/>
+                <w:szCs w:val="14"/>
+              </w:rPr>
+              <w:t xml:space="preserve">  labels:</w:t>
+            </w:r>
+          </w:p>
+          <w:p>
+            <w:pPr>
+              <w:spacing w:after="0" w:before="0" w:line="240"/>
+            </w:pPr>
+            <w:r>
+              <w:rPr>
+                <w:rFonts w:ascii="Consolas" w:cs="Consolas" w:eastAsia="Consolas" w:hAnsi="Consolas"/>
+                <w:sz w:val="14"/>
+                <w:szCs w:val="14"/>
+              </w:rPr>
+              <w:t xml:space="preserve">    app.kubernetes.io/name: devpod</w:t>
+            </w:r>
+          </w:p>
+          <w:p>
+            <w:pPr>
+              <w:spacing w:after="0" w:before="0" w:line="240"/>
+            </w:pPr>
+            <w:r>
+              <w:rPr>
+                <w:rFonts w:ascii="Consolas" w:cs="Consolas" w:eastAsia="Consolas" w:hAnsi="Consolas"/>
+                <w:sz w:val="14"/>
+                <w:szCs w:val="14"/>
+              </w:rPr>
+              <w:t xml:space="preserve">    app.kubernetes.io/part-of: homelab-dev</w:t>
+            </w:r>
+          </w:p>
+          <w:p>
+            <w:pPr>
+              <w:spacing w:after="0" w:before="0" w:line="240"/>
+            </w:pPr>
+            <w:r>
+              <w:rPr>
+                <w:rFonts w:ascii="Consolas" w:cs="Consolas" w:eastAsia="Consolas" w:hAnsi="Consolas"/>
+                <w:sz w:val="14"/>
+                <w:szCs w:val="14"/>
+              </w:rPr>
+              <w:t xml:space="preserve">    app.kubernetes.io/managed-by: devpod-nodeport</w:t>
+            </w:r>
+          </w:p>
+          <w:p>
+            <w:pPr>
+              <w:spacing w:after="0" w:before="0" w:line="240"/>
+            </w:pPr>
+            <w:r>
+              <w:rPr>
+                <w:rFonts w:ascii="Consolas" w:cs="Consolas" w:eastAsia="Consolas" w:hAnsi="Consolas"/>
+                <w:sz w:val="14"/>
+                <w:szCs w:val="14"/>
+              </w:rPr>
+              <w:t xml:space="preserve">spec:</w:t>
+            </w:r>
+          </w:p>
+          <w:p>
+            <w:pPr>
+              <w:spacing w:after="0" w:before="0" w:line="240"/>
+            </w:pPr>
+            <w:r>
+              <w:rPr>
+                <w:rFonts w:ascii="Consolas" w:cs="Consolas" w:eastAsia="Consolas" w:hAnsi="Consolas"/>
+                <w:sz w:val="14"/>
+                <w:szCs w:val="14"/>
+              </w:rPr>
+              <w:t xml:space="preserve">  type: NodePort</w:t>
+            </w:r>
+          </w:p>
+          <w:p>
+            <w:pPr>
+              <w:spacing w:after="0" w:before="0" w:line="240"/>
+            </w:pPr>
+            <w:r>
+              <w:rPr>
+                <w:rFonts w:ascii="Consolas" w:cs="Consolas" w:eastAsia="Consolas" w:hAnsi="Consolas"/>
+                <w:sz w:val="14"/>
+                <w:szCs w:val="14"/>
+              </w:rPr>
+              <w:t xml:space="preserve">  selector:</w:t>
+            </w:r>
+          </w:p>
+          <w:p>
+            <w:pPr>
+              <w:spacing w:after="0" w:before="0" w:line="240"/>
+            </w:pPr>
+            <w:r>
+              <w:rPr>
+                <w:rFonts w:ascii="Consolas" w:cs="Consolas" w:eastAsia="Consolas" w:hAnsi="Consolas"/>
+                <w:sz w:val="14"/>
+                <w:szCs w:val="14"/>
+              </w:rPr>
+              <w:t xml:space="preserve">    statefulset.kubernetes.io/pod-name: devpod-0</w:t>
+            </w:r>
+          </w:p>
+          <w:p>
+            <w:pPr>
+              <w:spacing w:after="0" w:before="0" w:line="240"/>
+            </w:pPr>
+            <w:r>
+              <w:rPr>
+                <w:rFonts w:ascii="Consolas" w:cs="Consolas" w:eastAsia="Consolas" w:hAnsi="Consolas"/>
+                <w:sz w:val="14"/>
+                <w:szCs w:val="14"/>
+              </w:rPr>
+              <w:t xml:space="preserve">  ports:</w:t>
+            </w:r>
+          </w:p>
+          <w:p>
+            <w:pPr>
+              <w:spacing w:after="0" w:before="0" w:line="240"/>
+            </w:pPr>
+            <w:r>
+              <w:rPr>
+                <w:rFonts w:ascii="Consolas" w:cs="Consolas" w:eastAsia="Consolas" w:hAnsi="Consolas"/>
+                <w:sz w:val="14"/>
+                <w:szCs w:val="14"/>
+              </w:rPr>
+              <w:t xml:space="preserve">    - name: ssh</w:t>
+            </w:r>
+          </w:p>
+          <w:p>
+            <w:pPr>
+              <w:spacing w:after="0" w:before="0" w:line="240"/>
+            </w:pPr>
+            <w:r>
+              <w:rPr>
+                <w:rFonts w:ascii="Consolas" w:cs="Consolas" w:eastAsia="Consolas" w:hAnsi="Consolas"/>
+                <w:sz w:val="14"/>
+                <w:szCs w:val="14"/>
+              </w:rPr>
+              <w:t xml:space="preserve">      port: 2222</w:t>
+            </w:r>
+          </w:p>
+          <w:p>
+            <w:pPr>
+              <w:spacing w:after="0" w:before="0" w:line="240"/>
+            </w:pPr>
+            <w:r>
+              <w:rPr>
+                <w:rFonts w:ascii="Consolas" w:cs="Consolas" w:eastAsia="Consolas" w:hAnsi="Consolas"/>
+                <w:sz w:val="14"/>
+                <w:szCs w:val="14"/>
+              </w:rPr>
+              <w:t xml:space="preserve">      targetPort: 2222</w:t>
+            </w:r>
+          </w:p>
+          <w:p>
+            <w:pPr>
+              <w:spacing w:after="0" w:before="0" w:line="240"/>
+            </w:pPr>
+            <w:r>
+              <w:rPr>
+                <w:rFonts w:ascii="Consolas" w:cs="Consolas" w:eastAsia="Consolas" w:hAnsi="Consolas"/>
+                <w:sz w:val="14"/>
+                <w:szCs w:val="14"/>
+              </w:rPr>
+              <w:t xml:space="preserve">      nodePort: 32222</w:t>
             </w:r>
           </w:p>
         </w:tc>
       </w:tr>
     </w:tbl>
+    <w:p>
+      <w:pPr>
+        <w:pStyle w:val="Heading1"/>
+        <w:pBdr>
+          <w:bottom w:val="single" w:color="1F4E79" w:sz="8" w:space="1"/>
+        </w:pBdr>
+        <w:spacing w:after="160" w:before="360"/>
+      </w:pPr>
+      <w:r>
+        <w:rPr>
+          <w:rFonts w:ascii="Arial" w:cs="Arial" w:eastAsia="Arial" w:hAnsi="Arial"/>
+          <w:b/>
+          <w:bCs/>
+          <w:color w:val="1F4E79"/>
+          <w:sz w:val="28"/>
+          <w:szCs w:val="28"/>
+        </w:rPr>
+        <w:t xml:space="preserve">Appendix A. Restore</w:t>
+      </w:r>
+    </w:p>
+    <w:p>
+      <w:pPr>
+        <w:spacing w:after="120" w:before="0" w:line="276"/>
+      </w:pPr>
+      <w:r>
+        <w:rPr>
+          <w:rFonts w:ascii="Arial" w:cs="Arial" w:eastAsia="Arial" w:hAnsi="Arial"/>
+          <w:sz w:val="22"/>
+          <w:szCs w:val="22"/>
+        </w:rPr>
+        <w:t xml:space="preserve">Write section 2 to apps/base/devpod/kustomization.yaml. Write section 3 to apps/base/devpod/nodeport-controller.yaml. Do not restore the rancher/kubectl image.</w:t>
+      </w:r>
+    </w:p>
+    <w:p>
+      <w:pPr>
+        <w:pStyle w:val="Heading1"/>
+        <w:pBdr>
+          <w:bottom w:val="single" w:color="1F4E79" w:sz="8" w:space="1"/>
+        </w:pBdr>
+        <w:spacing w:after="160" w:before="360"/>
+      </w:pPr>
+      <w:r>
+        <w:rPr>
+          <w:rFonts w:ascii="Arial" w:cs="Arial" w:eastAsia="Arial" w:hAnsi="Arial"/>
+          <w:b/>
+          <w:bCs/>
+          <w:color w:val="1F4E79"/>
+          <w:sz w:val="28"/>
+          <w:szCs w:val="28"/>
+        </w:rPr>
+        <w:t xml:space="preserve">Appendix B. kubectl and Linux commands</w:t>
+      </w:r>
+    </w:p>
     <w:p>
       <w:pPr>
         <w:spacing w:after="60" w:before="200"/>
@@ -1477,7 +3246,7 @@
           <w:sz w:val="20"/>
           <w:szCs w:val="20"/>
         </w:rPr>
-        <w:t xml:space="preserve">B.2 LAN login, no port-forward</w:t>
+        <w:t xml:space="preserve">B.1 Apply and confirm</w:t>
       </w:r>
     </w:p>
     <w:tbl>
@@ -1523,10 +3292,62 @@
             <w:r>
               <w:rPr>
                 <w:rFonts w:ascii="Consolas" w:cs="Consolas" w:eastAsia="Consolas" w:hAnsi="Consolas"/>
-                <w:sz w:val="15"/>
-                <w:szCs w:val="15"/>
-              </w:rPr>
-              <w:t xml:space="preserve">ssh -p 32222 -i ~/.ssh/id_ed25519 -o IdentitiesOnly=yes vscode@skynet-wrk-01</w:t>
+                <w:sz w:val="14"/>
+                <w:szCs w:val="14"/>
+              </w:rPr>
+              <w:t xml:space="preserve">flux reconcile kustomization apps -n flux-system --with-source</w:t>
+            </w:r>
+          </w:p>
+          <w:p>
+            <w:pPr>
+              <w:spacing w:after="0" w:before="0" w:line="240"/>
+            </w:pPr>
+            <w:r>
+              <w:rPr>
+                <w:rFonts w:ascii="Consolas" w:cs="Consolas" w:eastAsia="Consolas" w:hAnsi="Consolas"/>
+                <w:sz w:val="14"/>
+                <w:szCs w:val="14"/>
+              </w:rPr>
+              <w:t xml:space="preserve">kubectl apply -f apps/base/devpod/nodeport-controller.yaml</w:t>
+            </w:r>
+          </w:p>
+          <w:p>
+            <w:pPr>
+              <w:spacing w:after="0" w:before="0" w:line="240"/>
+            </w:pPr>
+            <w:r>
+              <w:rPr>
+                <w:rFonts w:ascii="Consolas" w:cs="Consolas" w:eastAsia="Consolas" w:hAnsi="Consolas"/>
+                <w:sz w:val="14"/>
+                <w:szCs w:val="14"/>
+              </w:rPr>
+              <w:t xml:space="preserve">kubectl -n devpod rollout status deploy/devpod-nodeport --timeout=180s</w:t>
+            </w:r>
+          </w:p>
+          <w:p>
+            <w:pPr>
+              <w:spacing w:after="0" w:before="0" w:line="240"/>
+            </w:pPr>
+            <w:r>
+              <w:rPr>
+                <w:rFonts w:ascii="Consolas" w:cs="Consolas" w:eastAsia="Consolas" w:hAnsi="Consolas"/>
+                <w:sz w:val="14"/>
+                <w:szCs w:val="14"/>
+              </w:rPr>
+              <w:t xml:space="preserve">kubectl -n devpod get pod -l app.kubernetes.io/name=devpod-nodeport</w:t>
+            </w:r>
+          </w:p>
+          <w:p>
+            <w:pPr>
+              <w:spacing w:after="0" w:before="0" w:line="240"/>
+            </w:pPr>
+            <w:r>
+              <w:rPr>
+                <w:rFonts w:ascii="Consolas" w:cs="Consolas" w:eastAsia="Consolas" w:hAnsi="Consolas"/>
+                <w:sz w:val="14"/>
+                <w:szCs w:val="14"/>
+              </w:rPr>
+              <w:t xml:space="preserve">kubectl -n devpod get svc -l app.kubernetes.io/managed-by=devpod-nodeport -o wide</w:t>
             </w:r>
           </w:p>
         </w:tc>
@@ -1545,7 +3366,7 @@
           <w:sz w:val="20"/>
           <w:szCs w:val="20"/>
         </w:rPr>
-        <w:t xml:space="preserve">B.3 Add a replica (Git, not kubectl scale)</w:t>
+        <w:t xml:space="preserve">B.2 LAN login</w:t>
       </w:r>
     </w:p>
     <w:tbl>
@@ -1591,36 +3412,10 @@
             <w:r>
               <w:rPr>
                 <w:rFonts w:ascii="Consolas" w:cs="Consolas" w:eastAsia="Consolas" w:hAnsi="Consolas"/>
-                <w:sz w:val="15"/>
-                <w:szCs w:val="15"/>
-              </w:rPr>
-              <w:t xml:space="preserve"># set spec.replicas: 2 in apps/base/devpod/devpod-statefulset.yaml, then merge</w:t>
-            </w:r>
-          </w:p>
-          <w:p>
-            <w:pPr>
-              <w:spacing w:after="0" w:before="0" w:line="240"/>
-            </w:pPr>
-            <w:r>
-              <w:rPr>
-                <w:rFonts w:ascii="Consolas" w:cs="Consolas" w:eastAsia="Consolas" w:hAnsi="Consolas"/>
-                <w:sz w:val="15"/>
-                <w:szCs w:val="15"/>
-              </w:rPr>
-              <w:t xml:space="preserve">kubectl -n devpod get pods,svc -l app.kubernetes.io/name=devpod</w:t>
-            </w:r>
-          </w:p>
-          <w:p>
-            <w:pPr>
-              <w:spacing w:after="0" w:before="0" w:line="240"/>
-            </w:pPr>
-            <w:r>
-              <w:rPr>
-                <w:rFonts w:ascii="Consolas" w:cs="Consolas" w:eastAsia="Consolas" w:hAnsi="Consolas"/>
-                <w:sz w:val="15"/>
-                <w:szCs w:val="15"/>
-              </w:rPr>
-              <w:t xml:space="preserve">ssh -p 32223 -i ~/.ssh/id_ed25519 -o IdentitiesOnly=yes vscode@skynet-wrk-01</w:t>
+                <w:sz w:val="14"/>
+                <w:szCs w:val="14"/>
+              </w:rPr>
+              <w:t xml:space="preserve">ssh -p 32222 -i ~/.ssh/id_ed25519 -o IdentitiesOnly=yes vscode@skynet-wrk-01</w:t>
             </w:r>
           </w:p>
         </w:tc>
@@ -1639,7 +3434,7 @@
           <w:sz w:val="20"/>
           <w:szCs w:val="20"/>
         </w:rPr>
-        <w:t xml:space="preserve">B.4 Prove a manual scale is reverted</w:t>
+        <w:t xml:space="preserve">B.3 Read a bad start</w:t>
       </w:r>
     </w:p>
     <w:tbl>
@@ -1685,62 +3480,23 @@
             <w:r>
               <w:rPr>
                 <w:rFonts w:ascii="Consolas" w:cs="Consolas" w:eastAsia="Consolas" w:hAnsi="Consolas"/>
-                <w:sz w:val="15"/>
-                <w:szCs w:val="15"/>
-              </w:rPr>
-              <w:t xml:space="preserve">kubectl -n devpod scale sts devpod --replicas=2</w:t>
-            </w:r>
-          </w:p>
-          <w:p>
-            <w:pPr>
-              <w:spacing w:after="0" w:before="0" w:line="240"/>
-            </w:pPr>
-            <w:r>
-              <w:rPr>
-                <w:rFonts w:ascii="Consolas" w:cs="Consolas" w:eastAsia="Consolas" w:hAnsi="Consolas"/>
-                <w:sz w:val="15"/>
-                <w:szCs w:val="15"/>
-              </w:rPr>
-              <w:t xml:space="preserve">kubectl -n devpod get sts devpod</w:t>
-            </w:r>
-          </w:p>
-          <w:p>
-            <w:pPr>
-              <w:spacing w:after="0" w:before="0" w:line="240"/>
-            </w:pPr>
-            <w:r>
-              <w:rPr>
-                <w:rFonts w:ascii="Consolas" w:cs="Consolas" w:eastAsia="Consolas" w:hAnsi="Consolas"/>
-                <w:sz w:val="15"/>
-                <w:szCs w:val="15"/>
-              </w:rPr>
-              <w:t xml:space="preserve"># after the next apps reconcile, replicas is back to the Git value</w:t>
-            </w:r>
-          </w:p>
-          <w:p>
-            <w:pPr>
-              <w:spacing w:after="0" w:before="0" w:line="240"/>
-            </w:pPr>
-            <w:r>
-              <w:rPr>
-                <w:rFonts w:ascii="Consolas" w:cs="Consolas" w:eastAsia="Consolas" w:hAnsi="Consolas"/>
-                <w:sz w:val="15"/>
-                <w:szCs w:val="15"/>
-              </w:rPr>
-              <w:t xml:space="preserve">flux reconcile kustomization apps -n flux-system --with-source</w:t>
-            </w:r>
-          </w:p>
-          <w:p>
-            <w:pPr>
-              <w:spacing w:after="0" w:before="0" w:line="240"/>
-            </w:pPr>
-            <w:r>
-              <w:rPr>
-                <w:rFonts w:ascii="Consolas" w:cs="Consolas" w:eastAsia="Consolas" w:hAnsi="Consolas"/>
-                <w:sz w:val="15"/>
-                <w:szCs w:val="15"/>
-              </w:rPr>
-              <w:t xml:space="preserve">kubectl -n devpod get sts devpod</w:t>
+                <w:sz w:val="14"/>
+                <w:szCs w:val="14"/>
+              </w:rPr>
+              <w:t xml:space="preserve">kubectl -n devpod describe pod -l app.kubernetes.io/name=devpod-nodeport</w:t>
+            </w:r>
+          </w:p>
+          <w:p>
+            <w:pPr>
+              <w:spacing w:after="0" w:before="0" w:line="240"/>
+            </w:pPr>
+            <w:r>
+              <w:rPr>
+                <w:rFonts w:ascii="Consolas" w:cs="Consolas" w:eastAsia="Consolas" w:hAnsi="Consolas"/>
+                <w:sz w:val="14"/>
+                <w:szCs w:val="14"/>
+              </w:rPr>
+              <w:t xml:space="preserve">kubectl -n devpod logs deploy/devpod-nodeport --tail=40</w:t>
             </w:r>
           </w:p>
         </w:tc>
@@ -2222,7 +3978,7 @@
     <w:next w:val="Normal"/>
     <w:qFormat/>
     <w:pPr>
-      <w:spacing w:after="100" w:before="280"/>
+      <w:spacing w:after="80" w:before="240"/>
       <w:outlineLvl w:val="1"/>
     </w:pPr>
     <w:rPr>

</xml_diff>